<commit_message>
Update Pharmaplex platform specifications to include new features for admin settings and promotional campaigns
</commit_message>
<xml_diff>
--- a/spec/Pharmaplex-Platform-Spec.docx
+++ b/spec/Pharmaplex-Platform-Spec.docx
@@ -34,7 +34,7 @@
           <w:sz w:val="72"/>
           <w:szCs w:val="72"/>
         </w:rPr>
-        <w:t xml:space="preserve">Spec ระบบโปรโมชั่น คูปอง พอยท์ แคมเปญ สุ่มรางวัล และบริการสั่งทำพิเศษ</w:t>
+        <w:t xml:space="preserve">Spec ระบบโปรโมชั่น คูปอง พอยท์ แคมเปญ สุ่มรางวัล บริการสั่งทำพิเศษ และเซตร้านยาเปิดใหม่</w:t>
       </w:r>
     </w:p>
     <w:p>
@@ -6771,6 +6771,593 @@
     </w:p>
     <w:p>
       <w:pPr>
+        <w:pStyle w:val="Heading3"/>
+        <w:keepNext/>
+        <w:spacing w:after="120" w:before="240"/>
+      </w:pPr>
+      <w:r>
+        <w:rPr>
+          <w:rFonts w:ascii="TH SarabunPSK" w:cs="TH SarabunPSK" w:eastAsia="TH SarabunPSK" w:hAnsi="TH SarabunPSK"/>
+          <w:b/>
+          <w:bCs/>
+          <w:color w:val="A32F34"/>
+          <w:sz w:val="32"/>
+          <w:szCs w:val="32"/>
+        </w:rPr>
+        <w:t xml:space="preserve">2.12 การตั้งค่าของแอดมินต่อสินค้า</w:t>
+      </w:r>
+    </w:p>
+    <w:tbl>
+      <w:tblPr>
+        <w:tblW w:type="dxa" w:w="9026"/>
+        <w:tblBorders>
+          <w:top w:val="single" w:color="auto" w:sz="4"/>
+          <w:left w:val="single" w:color="auto" w:sz="4"/>
+          <w:bottom w:val="single" w:color="auto" w:sz="4"/>
+          <w:right w:val="single" w:color="auto" w:sz="4"/>
+          <w:insideH w:val="single" w:color="auto" w:sz="4"/>
+          <w:insideV w:val="single" w:color="auto" w:sz="4"/>
+        </w:tblBorders>
+      </w:tblPr>
+      <w:tblGrid>
+        <w:gridCol w:w="2941"/>
+        <w:gridCol w:w="6085"/>
+      </w:tblGrid>
+      <w:tr>
+        <w:trPr>
+          <w:tblHeader/>
+        </w:trPr>
+        <w:tc>
+          <w:tcPr>
+            <w:tcW w:type="dxa" w:w="2941"/>
+            <w:shd w:fill="A32F34" w:color="auto" w:val="clear"/>
+            <w:tcMar>
+              <w:top w:type="dxa" w:w="60"/>
+              <w:left w:type="dxa" w:w="90"/>
+              <w:bottom w:type="dxa" w:w="60"/>
+              <w:right w:type="dxa" w:w="90"/>
+            </w:tcMar>
+          </w:tcPr>
+          <w:p>
+            <w:pPr>
+              <w:spacing w:after="0" w:before="0"/>
+            </w:pPr>
+            <w:r>
+              <w:rPr>
+                <w:rFonts w:ascii="TH SarabunPSK" w:cs="TH SarabunPSK" w:eastAsia="TH SarabunPSK" w:hAnsi="TH SarabunPSK"/>
+                <w:b/>
+                <w:bCs/>
+                <w:color w:val="FFFFFF"/>
+                <w:sz w:val="27"/>
+                <w:szCs w:val="27"/>
+              </w:rPr>
+              <w:t xml:space="preserve">หัวข้อที่ตั้งค่า</w:t>
+            </w:r>
+          </w:p>
+        </w:tc>
+        <w:tc>
+          <w:tcPr>
+            <w:tcW w:type="dxa" w:w="6085"/>
+            <w:shd w:fill="A32F34" w:color="auto" w:val="clear"/>
+            <w:tcMar>
+              <w:top w:type="dxa" w:w="60"/>
+              <w:left w:type="dxa" w:w="90"/>
+              <w:bottom w:type="dxa" w:w="60"/>
+              <w:right w:type="dxa" w:w="90"/>
+            </w:tcMar>
+          </w:tcPr>
+          <w:p>
+            <w:pPr>
+              <w:spacing w:after="0" w:before="0"/>
+            </w:pPr>
+            <w:r>
+              <w:rPr>
+                <w:rFonts w:ascii="TH SarabunPSK" w:cs="TH SarabunPSK" w:eastAsia="TH SarabunPSK" w:hAnsi="TH SarabunPSK"/>
+                <w:b/>
+                <w:bCs/>
+                <w:color w:val="FFFFFF"/>
+                <w:sz w:val="27"/>
+                <w:szCs w:val="27"/>
+              </w:rPr>
+              <w:t xml:space="preserve">รายละเอียด</w:t>
+            </w:r>
+          </w:p>
+        </w:tc>
+      </w:tr>
+      <w:tr>
+        <w:tc>
+          <w:tcPr>
+            <w:tcW w:type="dxa" w:w="2941"/>
+            <w:tcMar>
+              <w:top w:type="dxa" w:w="60"/>
+              <w:left w:type="dxa" w:w="90"/>
+              <w:bottom w:type="dxa" w:w="60"/>
+              <w:right w:type="dxa" w:w="90"/>
+            </w:tcMar>
+          </w:tcPr>
+          <w:p>
+            <w:pPr>
+              <w:spacing w:after="0" w:before="0"/>
+            </w:pPr>
+            <w:r>
+              <w:rPr>
+                <w:rFonts w:ascii="TH SarabunPSK" w:cs="TH SarabunPSK" w:eastAsia="TH SarabunPSK" w:hAnsi="TH SarabunPSK"/>
+                <w:b w:val="false"/>
+                <w:bCs w:val="false"/>
+                <w:sz w:val="27"/>
+                <w:szCs w:val="27"/>
+              </w:rPr>
+              <w:t xml:space="preserve">ข้อมูลสินค้า</w:t>
+            </w:r>
+          </w:p>
+        </w:tc>
+        <w:tc>
+          <w:tcPr>
+            <w:tcW w:type="dxa" w:w="6085"/>
+            <w:tcMar>
+              <w:top w:type="dxa" w:w="60"/>
+              <w:left w:type="dxa" w:w="90"/>
+              <w:bottom w:type="dxa" w:w="60"/>
+              <w:right w:type="dxa" w:w="90"/>
+            </w:tcMar>
+          </w:tcPr>
+          <w:p>
+            <w:pPr>
+              <w:spacing w:after="0" w:before="0"/>
+            </w:pPr>
+            <w:r>
+              <w:rPr>
+                <w:rFonts w:ascii="TH SarabunPSK" w:cs="TH SarabunPSK" w:eastAsia="TH SarabunPSK" w:hAnsi="TH SarabunPSK"/>
+                <w:b w:val="false"/>
+                <w:bCs w:val="false"/>
+                <w:sz w:val="27"/>
+                <w:szCs w:val="27"/>
+              </w:rPr>
+              <w:t xml:space="preserve">ชื่อ คำอธิบาย เงื่อนไขการใช้งาน (terms) ระยะเวลาผลิต เปิด/ปิดการขาย และลำดับการแสดงผล</w:t>
+            </w:r>
+          </w:p>
+        </w:tc>
+      </w:tr>
+      <w:tr>
+        <w:tc>
+          <w:tcPr>
+            <w:tcW w:type="dxa" w:w="2941"/>
+            <w:tcMar>
+              <w:top w:type="dxa" w:w="60"/>
+              <w:left w:type="dxa" w:w="90"/>
+              <w:bottom w:type="dxa" w:w="60"/>
+              <w:right w:type="dxa" w:w="90"/>
+            </w:tcMar>
+          </w:tcPr>
+          <w:p>
+            <w:pPr>
+              <w:spacing w:after="0" w:before="0"/>
+            </w:pPr>
+            <w:r>
+              <w:rPr>
+                <w:rFonts w:ascii="TH SarabunPSK" w:cs="TH SarabunPSK" w:eastAsia="TH SarabunPSK" w:hAnsi="TH SarabunPSK"/>
+                <w:b w:val="false"/>
+                <w:bCs w:val="false"/>
+                <w:sz w:val="27"/>
+                <w:szCs w:val="27"/>
+              </w:rPr>
+              <w:t xml:space="preserve">โหมดราคา</w:t>
+            </w:r>
+          </w:p>
+        </w:tc>
+        <w:tc>
+          <w:tcPr>
+            <w:tcW w:type="dxa" w:w="6085"/>
+            <w:tcMar>
+              <w:top w:type="dxa" w:w="60"/>
+              <w:left w:type="dxa" w:w="90"/>
+              <w:bottom w:type="dxa" w:w="60"/>
+              <w:right w:type="dxa" w:w="90"/>
+            </w:tcMar>
+          </w:tcPr>
+          <w:p>
+            <w:pPr>
+              <w:spacing w:after="0" w:before="0"/>
+            </w:pPr>
+            <w:r>
+              <w:rPr>
+                <w:rFonts w:ascii="TH SarabunPSK" w:cs="TH SarabunPSK" w:eastAsia="TH SarabunPSK" w:hAnsi="TH SarabunPSK"/>
+                <w:b w:val="false"/>
+                <w:bCs w:val="false"/>
+                <w:sz w:val="27"/>
+                <w:szCs w:val="27"/>
+              </w:rPr>
+              <w:t xml:space="preserve">เลือกคิดราคาต่อหน่วยหรือต่อตารางเมตร พร้อมตั้งพื้นที่คิดขั้นต่ำ (เฉพาะโหมดต่อตารางเมตร)</w:t>
+            </w:r>
+          </w:p>
+        </w:tc>
+      </w:tr>
+      <w:tr>
+        <w:tc>
+          <w:tcPr>
+            <w:tcW w:type="dxa" w:w="2941"/>
+            <w:tcMar>
+              <w:top w:type="dxa" w:w="60"/>
+              <w:left w:type="dxa" w:w="90"/>
+              <w:bottom w:type="dxa" w:w="60"/>
+              <w:right w:type="dxa" w:w="90"/>
+            </w:tcMar>
+          </w:tcPr>
+          <w:p>
+            <w:pPr>
+              <w:spacing w:after="0" w:before="0"/>
+            </w:pPr>
+            <w:r>
+              <w:rPr>
+                <w:rFonts w:ascii="TH SarabunPSK" w:cs="TH SarabunPSK" w:eastAsia="TH SarabunPSK" w:hAnsi="TH SarabunPSK"/>
+                <w:b w:val="false"/>
+                <w:bCs w:val="false"/>
+                <w:sz w:val="27"/>
+                <w:szCs w:val="27"/>
+              </w:rPr>
+              <w:t xml:space="preserve">ตัวเลือกสินค้า (แกนตัวเลือก)</w:t>
+            </w:r>
+          </w:p>
+        </w:tc>
+        <w:tc>
+          <w:tcPr>
+            <w:tcW w:type="dxa" w:w="6085"/>
+            <w:tcMar>
+              <w:top w:type="dxa" w:w="60"/>
+              <w:left w:type="dxa" w:w="90"/>
+              <w:bottom w:type="dxa" w:w="60"/>
+              <w:right w:type="dxa" w:w="90"/>
+            </w:tcMar>
+          </w:tcPr>
+          <w:p>
+            <w:pPr>
+              <w:spacing w:after="0" w:before="0"/>
+            </w:pPr>
+            <w:r>
+              <w:rPr>
+                <w:rFonts w:ascii="TH SarabunPSK" w:cs="TH SarabunPSK" w:eastAsia="TH SarabunPSK" w:hAnsi="TH SarabunPSK"/>
+                <w:b w:val="false"/>
+                <w:bCs w:val="false"/>
+                <w:sz w:val="27"/>
+                <w:szCs w:val="27"/>
+              </w:rPr>
+              <w:t xml:space="preserve">สร้างได้หลายแกน เลือกรูปแบบแสดงผล (ปุ่มข้อความ / สี / ขนาด) และตั้งว่าแกนไหน "มีผลต่อราคา"</w:t>
+            </w:r>
+          </w:p>
+        </w:tc>
+      </w:tr>
+      <w:tr>
+        <w:tc>
+          <w:tcPr>
+            <w:tcW w:type="dxa" w:w="2941"/>
+            <w:tcMar>
+              <w:top w:type="dxa" w:w="60"/>
+              <w:left w:type="dxa" w:w="90"/>
+              <w:bottom w:type="dxa" w:w="60"/>
+              <w:right w:type="dxa" w:w="90"/>
+            </w:tcMar>
+          </w:tcPr>
+          <w:p>
+            <w:pPr>
+              <w:spacing w:after="0" w:before="0"/>
+            </w:pPr>
+            <w:r>
+              <w:rPr>
+                <w:rFonts w:ascii="TH SarabunPSK" w:cs="TH SarabunPSK" w:eastAsia="TH SarabunPSK" w:hAnsi="TH SarabunPSK"/>
+                <w:b w:val="false"/>
+                <w:bCs w:val="false"/>
+                <w:sz w:val="27"/>
+                <w:szCs w:val="27"/>
+              </w:rPr>
+              <w:t xml:space="preserve">ตารางราคา</w:t>
+            </w:r>
+          </w:p>
+        </w:tc>
+        <w:tc>
+          <w:tcPr>
+            <w:tcW w:type="dxa" w:w="6085"/>
+            <w:tcMar>
+              <w:top w:type="dxa" w:w="60"/>
+              <w:left w:type="dxa" w:w="90"/>
+              <w:bottom w:type="dxa" w:w="60"/>
+              <w:right w:type="dxa" w:w="90"/>
+            </w:tcMar>
+          </w:tcPr>
+          <w:p>
+            <w:pPr>
+              <w:spacing w:after="0" w:before="0"/>
+            </w:pPr>
+            <w:r>
+              <w:rPr>
+                <w:rFonts w:ascii="TH SarabunPSK" w:cs="TH SarabunPSK" w:eastAsia="TH SarabunPSK" w:hAnsi="TH SarabunPSK"/>
+                <w:b w:val="false"/>
+                <w:bCs w:val="false"/>
+                <w:sz w:val="27"/>
+                <w:szCs w:val="27"/>
+              </w:rPr>
+              <w:t xml:space="preserve">กำหนดราคาตามชุดตัวเลือก คูณกับระดับราคาตามจำนวน ช่องว่าง = ไม่ขายชุดนั้น</w:t>
+            </w:r>
+          </w:p>
+        </w:tc>
+      </w:tr>
+      <w:tr>
+        <w:tc>
+          <w:tcPr>
+            <w:tcW w:type="dxa" w:w="2941"/>
+            <w:tcMar>
+              <w:top w:type="dxa" w:w="60"/>
+              <w:left w:type="dxa" w:w="90"/>
+              <w:bottom w:type="dxa" w:w="60"/>
+              <w:right w:type="dxa" w:w="90"/>
+            </w:tcMar>
+          </w:tcPr>
+          <w:p>
+            <w:pPr>
+              <w:spacing w:after="0" w:before="0"/>
+            </w:pPr>
+            <w:r>
+              <w:rPr>
+                <w:rFonts w:ascii="TH SarabunPSK" w:cs="TH SarabunPSK" w:eastAsia="TH SarabunPSK" w:hAnsi="TH SarabunPSK"/>
+                <w:b w:val="false"/>
+                <w:bCs w:val="false"/>
+                <w:sz w:val="27"/>
+                <w:szCs w:val="27"/>
+              </w:rPr>
+              <w:t xml:space="preserve">ค่าบล็อค</w:t>
+            </w:r>
+          </w:p>
+        </w:tc>
+        <w:tc>
+          <w:tcPr>
+            <w:tcW w:type="dxa" w:w="6085"/>
+            <w:tcMar>
+              <w:top w:type="dxa" w:w="60"/>
+              <w:left w:type="dxa" w:w="90"/>
+              <w:bottom w:type="dxa" w:w="60"/>
+              <w:right w:type="dxa" w:w="90"/>
+            </w:tcMar>
+          </w:tcPr>
+          <w:p>
+            <w:pPr>
+              <w:spacing w:after="0" w:before="0"/>
+            </w:pPr>
+            <w:r>
+              <w:rPr>
+                <w:rFonts w:ascii="TH SarabunPSK" w:cs="TH SarabunPSK" w:eastAsia="TH SarabunPSK" w:hAnsi="TH SarabunPSK"/>
+                <w:b w:val="false"/>
+                <w:bCs w:val="false"/>
+                <w:sz w:val="27"/>
+                <w:szCs w:val="27"/>
+              </w:rPr>
+              <w:t xml:space="preserve">เปิดหรือปิดค่าบล็อค และตั้งราคาแยกตามแถวราคาได้</w:t>
+            </w:r>
+          </w:p>
+        </w:tc>
+      </w:tr>
+      <w:tr>
+        <w:tc>
+          <w:tcPr>
+            <w:tcW w:type="dxa" w:w="2941"/>
+            <w:tcMar>
+              <w:top w:type="dxa" w:w="60"/>
+              <w:left w:type="dxa" w:w="90"/>
+              <w:bottom w:type="dxa" w:w="60"/>
+              <w:right w:type="dxa" w:w="90"/>
+            </w:tcMar>
+          </w:tcPr>
+          <w:p>
+            <w:pPr>
+              <w:spacing w:after="0" w:before="0"/>
+            </w:pPr>
+            <w:r>
+              <w:rPr>
+                <w:rFonts w:ascii="TH SarabunPSK" w:cs="TH SarabunPSK" w:eastAsia="TH SarabunPSK" w:hAnsi="TH SarabunPSK"/>
+                <w:b w:val="false"/>
+                <w:bCs w:val="false"/>
+                <w:sz w:val="27"/>
+                <w:szCs w:val="27"/>
+              </w:rPr>
+              <w:t xml:space="preserve">ช่องข้อมูลลูกค้า (infoFields)</w:t>
+            </w:r>
+          </w:p>
+        </w:tc>
+        <w:tc>
+          <w:tcPr>
+            <w:tcW w:type="dxa" w:w="6085"/>
+            <w:tcMar>
+              <w:top w:type="dxa" w:w="60"/>
+              <w:left w:type="dxa" w:w="90"/>
+              <w:bottom w:type="dxa" w:w="60"/>
+              <w:right w:type="dxa" w:w="90"/>
+            </w:tcMar>
+          </w:tcPr>
+          <w:p>
+            <w:pPr>
+              <w:spacing w:after="0" w:before="0"/>
+            </w:pPr>
+            <w:r>
+              <w:rPr>
+                <w:rFonts w:ascii="TH SarabunPSK" w:cs="TH SarabunPSK" w:eastAsia="TH SarabunPSK" w:hAnsi="TH SarabunPSK"/>
+                <w:b w:val="false"/>
+                <w:bCs w:val="false"/>
+                <w:sz w:val="27"/>
+                <w:szCs w:val="27"/>
+              </w:rPr>
+              <w:t xml:space="preserve">สร้างได้สูงสุด 20 ช่อง เลือกชนิดช่อง (ข้อความ / ข้อความหลายบรรทัด / ไฟล์) และตั้งให้เติมค่าจาก POS ล่วงหน้า</w:t>
+            </w:r>
+          </w:p>
+        </w:tc>
+      </w:tr>
+      <w:tr>
+        <w:tc>
+          <w:tcPr>
+            <w:tcW w:type="dxa" w:w="2941"/>
+            <w:tcMar>
+              <w:top w:type="dxa" w:w="60"/>
+              <w:left w:type="dxa" w:w="90"/>
+              <w:bottom w:type="dxa" w:w="60"/>
+              <w:right w:type="dxa" w:w="90"/>
+            </w:tcMar>
+          </w:tcPr>
+          <w:p>
+            <w:pPr>
+              <w:spacing w:after="0" w:before="0"/>
+            </w:pPr>
+            <w:r>
+              <w:rPr>
+                <w:rFonts w:ascii="TH SarabunPSK" w:cs="TH SarabunPSK" w:eastAsia="TH SarabunPSK" w:hAnsi="TH SarabunPSK"/>
+                <w:b w:val="false"/>
+                <w:bCs w:val="false"/>
+                <w:sz w:val="27"/>
+                <w:szCs w:val="27"/>
+              </w:rPr>
+              <w:t xml:space="preserve">แบบ Mockup</w:t>
+            </w:r>
+          </w:p>
+        </w:tc>
+        <w:tc>
+          <w:tcPr>
+            <w:tcW w:type="dxa" w:w="6085"/>
+            <w:tcMar>
+              <w:top w:type="dxa" w:w="60"/>
+              <w:left w:type="dxa" w:w="90"/>
+              <w:bottom w:type="dxa" w:w="60"/>
+              <w:right w:type="dxa" w:w="90"/>
+            </w:tcMar>
+          </w:tcPr>
+          <w:p>
+            <w:pPr>
+              <w:spacing w:after="0" w:before="0"/>
+            </w:pPr>
+            <w:r>
+              <w:rPr>
+                <w:rFonts w:ascii="TH SarabunPSK" w:cs="TH SarabunPSK" w:eastAsia="TH SarabunPSK" w:hAnsi="TH SarabunPSK"/>
+                <w:b w:val="false"/>
+                <w:bCs w:val="false"/>
+                <w:sz w:val="27"/>
+                <w:szCs w:val="27"/>
+              </w:rPr>
+              <w:t xml:space="preserve">อัปโหลดไฟล์ .ai / .pdf หรือภาพนิ่ง ผูกกับตัวเลือกที่ต้องการ จัดกลุ่มสีในแบบ และผูกแต่ละกลุ่มกับแกนสี</w:t>
+            </w:r>
+          </w:p>
+        </w:tc>
+      </w:tr>
+      <w:tr>
+        <w:tc>
+          <w:tcPr>
+            <w:tcW w:type="dxa" w:w="2941"/>
+            <w:tcMar>
+              <w:top w:type="dxa" w:w="60"/>
+              <w:left w:type="dxa" w:w="90"/>
+              <w:bottom w:type="dxa" w:w="60"/>
+              <w:right w:type="dxa" w:w="90"/>
+            </w:tcMar>
+          </w:tcPr>
+          <w:p>
+            <w:pPr>
+              <w:spacing w:after="0" w:before="0"/>
+            </w:pPr>
+            <w:r>
+              <w:rPr>
+                <w:rFonts w:ascii="TH SarabunPSK" w:cs="TH SarabunPSK" w:eastAsia="TH SarabunPSK" w:hAnsi="TH SarabunPSK"/>
+                <w:b w:val="false"/>
+                <w:bCs w:val="false"/>
+                <w:sz w:val="27"/>
+                <w:szCs w:val="27"/>
+              </w:rPr>
+              <w:t xml:space="preserve">จำนวนสั่งซื้อ</w:t>
+            </w:r>
+          </w:p>
+        </w:tc>
+        <w:tc>
+          <w:tcPr>
+            <w:tcW w:type="dxa" w:w="6085"/>
+            <w:tcMar>
+              <w:top w:type="dxa" w:w="60"/>
+              <w:left w:type="dxa" w:w="90"/>
+              <w:bottom w:type="dxa" w:w="60"/>
+              <w:right w:type="dxa" w:w="90"/>
+            </w:tcMar>
+          </w:tcPr>
+          <w:p>
+            <w:pPr>
+              <w:spacing w:after="0" w:before="0"/>
+            </w:pPr>
+            <w:r>
+              <w:rPr>
+                <w:rFonts w:ascii="TH SarabunPSK" w:cs="TH SarabunPSK" w:eastAsia="TH SarabunPSK" w:hAnsi="TH SarabunPSK"/>
+                <w:b w:val="false"/>
+                <w:bCs w:val="false"/>
+                <w:sz w:val="27"/>
+                <w:szCs w:val="27"/>
+              </w:rPr>
+              <w:t xml:space="preserve">ตั้งปุ่มจำนวนสำเร็จรูป และเปิด/ปิดให้ลูกค้ากรอกจำนวนเอง</w:t>
+            </w:r>
+          </w:p>
+        </w:tc>
+      </w:tr>
+      <w:tr>
+        <w:tc>
+          <w:tcPr>
+            <w:tcW w:type="dxa" w:w="2941"/>
+            <w:tcMar>
+              <w:top w:type="dxa" w:w="60"/>
+              <w:left w:type="dxa" w:w="90"/>
+              <w:bottom w:type="dxa" w:w="60"/>
+              <w:right w:type="dxa" w:w="90"/>
+            </w:tcMar>
+          </w:tcPr>
+          <w:p>
+            <w:pPr>
+              <w:spacing w:after="0" w:before="0"/>
+            </w:pPr>
+            <w:r>
+              <w:rPr>
+                <w:rFonts w:ascii="TH SarabunPSK" w:cs="TH SarabunPSK" w:eastAsia="TH SarabunPSK" w:hAnsi="TH SarabunPSK"/>
+                <w:b w:val="false"/>
+                <w:bCs w:val="false"/>
+                <w:sz w:val="27"/>
+                <w:szCs w:val="27"/>
+              </w:rPr>
+              <w:t xml:space="preserve">ปีของสินค้า</w:t>
+            </w:r>
+          </w:p>
+        </w:tc>
+        <w:tc>
+          <w:tcPr>
+            <w:tcW w:type="dxa" w:w="6085"/>
+            <w:tcMar>
+              <w:top w:type="dxa" w:w="60"/>
+              <w:left w:type="dxa" w:w="90"/>
+              <w:bottom w:type="dxa" w:w="60"/>
+              <w:right w:type="dxa" w:w="90"/>
+            </w:tcMar>
+          </w:tcPr>
+          <w:p>
+            <w:pPr>
+              <w:spacing w:after="0" w:before="0"/>
+            </w:pPr>
+            <w:r>
+              <w:rPr>
+                <w:rFonts w:ascii="TH SarabunPSK" w:cs="TH SarabunPSK" w:eastAsia="TH SarabunPSK" w:hAnsi="TH SarabunPSK"/>
+                <w:b w:val="false"/>
+                <w:bCs w:val="false"/>
+                <w:sz w:val="27"/>
+                <w:szCs w:val="27"/>
+              </w:rPr>
+              <w:t xml:space="preserve">คัดลอกตัวเลือก ราคา และแบบ Mockup จากปีก่อนหน้าไปตั้งต้นปีใหม่ได้</w:t>
+            </w:r>
+          </w:p>
+        </w:tc>
+      </w:tr>
+    </w:tbl>
+    <w:p>
+      <w:pPr>
+        <w:spacing w:after="120"/>
+      </w:pPr>
+    </w:p>
+    <w:p>
+      <w:pPr>
         <w:pStyle w:val="Heading2"/>
         <w:pageBreakBefore/>
         <w:pBdr>
@@ -7961,6 +8548,305 @@
         <w:t xml:space="preserve">แอดมินกำหนดวันและเวลา เลือกกลุ่มสินค้าเฉพาะที่เข้าร่วม (ไม่ใช่สินค้าทั้งหมด) ตั้งเปอร์เซ็นต์ส่วนลดและโควตาจำนวนจำกัดของรอบ ถึงเวลาที่ตั้งไว้ราคาเปลี่ยนให้อัตโนมัติ เมื่อหมดโควตาหรือหมดเวลา ราคาจะกลับเป็นปกติทันทีโดยไม่ต้องมีคนกดปิด</w:t>
       </w:r>
     </w:p>
+    <w:tbl>
+      <w:tblPr>
+        <w:tblW w:type="dxa" w:w="9026"/>
+        <w:tblBorders>
+          <w:top w:val="single" w:color="auto" w:sz="4"/>
+          <w:left w:val="single" w:color="auto" w:sz="4"/>
+          <w:bottom w:val="single" w:color="auto" w:sz="4"/>
+          <w:right w:val="single" w:color="auto" w:sz="4"/>
+          <w:insideH w:val="single" w:color="auto" w:sz="4"/>
+          <w:insideV w:val="single" w:color="auto" w:sz="4"/>
+        </w:tblBorders>
+      </w:tblPr>
+      <w:tblGrid>
+        <w:gridCol w:w="2579"/>
+        <w:gridCol w:w="6447"/>
+      </w:tblGrid>
+      <w:tr>
+        <w:trPr>
+          <w:tblHeader/>
+        </w:trPr>
+        <w:tc>
+          <w:tcPr>
+            <w:tcW w:type="dxa" w:w="2579"/>
+            <w:shd w:fill="A32F34" w:color="auto" w:val="clear"/>
+            <w:tcMar>
+              <w:top w:type="dxa" w:w="60"/>
+              <w:left w:type="dxa" w:w="90"/>
+              <w:bottom w:type="dxa" w:w="60"/>
+              <w:right w:type="dxa" w:w="90"/>
+            </w:tcMar>
+          </w:tcPr>
+          <w:p>
+            <w:pPr>
+              <w:spacing w:after="0" w:before="0"/>
+            </w:pPr>
+            <w:r>
+              <w:rPr>
+                <w:rFonts w:ascii="TH SarabunPSK" w:cs="TH SarabunPSK" w:eastAsia="TH SarabunPSK" w:hAnsi="TH SarabunPSK"/>
+                <w:b/>
+                <w:bCs/>
+                <w:color w:val="FFFFFF"/>
+                <w:sz w:val="27"/>
+                <w:szCs w:val="27"/>
+              </w:rPr>
+              <w:t xml:space="preserve">หัวข้อที่ตั้งค่า</w:t>
+            </w:r>
+          </w:p>
+        </w:tc>
+        <w:tc>
+          <w:tcPr>
+            <w:tcW w:type="dxa" w:w="6447"/>
+            <w:shd w:fill="A32F34" w:color="auto" w:val="clear"/>
+            <w:tcMar>
+              <w:top w:type="dxa" w:w="60"/>
+              <w:left w:type="dxa" w:w="90"/>
+              <w:bottom w:type="dxa" w:w="60"/>
+              <w:right w:type="dxa" w:w="90"/>
+            </w:tcMar>
+          </w:tcPr>
+          <w:p>
+            <w:pPr>
+              <w:spacing w:after="0" w:before="0"/>
+            </w:pPr>
+            <w:r>
+              <w:rPr>
+                <w:rFonts w:ascii="TH SarabunPSK" w:cs="TH SarabunPSK" w:eastAsia="TH SarabunPSK" w:hAnsi="TH SarabunPSK"/>
+                <w:b/>
+                <w:bCs/>
+                <w:color w:val="FFFFFF"/>
+                <w:sz w:val="27"/>
+                <w:szCs w:val="27"/>
+              </w:rPr>
+              <w:t xml:space="preserve">รายละเอียด</w:t>
+            </w:r>
+          </w:p>
+        </w:tc>
+      </w:tr>
+      <w:tr>
+        <w:tc>
+          <w:tcPr>
+            <w:tcW w:type="dxa" w:w="2579"/>
+            <w:tcMar>
+              <w:top w:type="dxa" w:w="60"/>
+              <w:left w:type="dxa" w:w="90"/>
+              <w:bottom w:type="dxa" w:w="60"/>
+              <w:right w:type="dxa" w:w="90"/>
+            </w:tcMar>
+          </w:tcPr>
+          <w:p>
+            <w:pPr>
+              <w:spacing w:after="0" w:before="0"/>
+            </w:pPr>
+            <w:r>
+              <w:rPr>
+                <w:rFonts w:ascii="TH SarabunPSK" w:cs="TH SarabunPSK" w:eastAsia="TH SarabunPSK" w:hAnsi="TH SarabunPSK"/>
+                <w:b w:val="false"/>
+                <w:bCs w:val="false"/>
+                <w:sz w:val="27"/>
+                <w:szCs w:val="27"/>
+              </w:rPr>
+              <w:t xml:space="preserve">ช่วงเวลา</w:t>
+            </w:r>
+          </w:p>
+        </w:tc>
+        <w:tc>
+          <w:tcPr>
+            <w:tcW w:type="dxa" w:w="6447"/>
+            <w:tcMar>
+              <w:top w:type="dxa" w:w="60"/>
+              <w:left w:type="dxa" w:w="90"/>
+              <w:bottom w:type="dxa" w:w="60"/>
+              <w:right w:type="dxa" w:w="90"/>
+            </w:tcMar>
+          </w:tcPr>
+          <w:p>
+            <w:pPr>
+              <w:spacing w:after="0" w:before="0"/>
+            </w:pPr>
+            <w:r>
+              <w:rPr>
+                <w:rFonts w:ascii="TH SarabunPSK" w:cs="TH SarabunPSK" w:eastAsia="TH SarabunPSK" w:hAnsi="TH SarabunPSK"/>
+                <w:b w:val="false"/>
+                <w:bCs w:val="false"/>
+                <w:sz w:val="27"/>
+                <w:szCs w:val="27"/>
+              </w:rPr>
+              <w:t xml:space="preserve">วันและเวลาเริ่มต้น–สิ้นสุด</w:t>
+            </w:r>
+          </w:p>
+        </w:tc>
+      </w:tr>
+      <w:tr>
+        <w:tc>
+          <w:tcPr>
+            <w:tcW w:type="dxa" w:w="2579"/>
+            <w:tcMar>
+              <w:top w:type="dxa" w:w="60"/>
+              <w:left w:type="dxa" w:w="90"/>
+              <w:bottom w:type="dxa" w:w="60"/>
+              <w:right w:type="dxa" w:w="90"/>
+            </w:tcMar>
+          </w:tcPr>
+          <w:p>
+            <w:pPr>
+              <w:spacing w:after="0" w:before="0"/>
+            </w:pPr>
+            <w:r>
+              <w:rPr>
+                <w:rFonts w:ascii="TH SarabunPSK" w:cs="TH SarabunPSK" w:eastAsia="TH SarabunPSK" w:hAnsi="TH SarabunPSK"/>
+                <w:b w:val="false"/>
+                <w:bCs w:val="false"/>
+                <w:sz w:val="27"/>
+                <w:szCs w:val="27"/>
+              </w:rPr>
+              <w:t xml:space="preserve">กลุ่มสินค้าที่ร่วมรายการ</w:t>
+            </w:r>
+          </w:p>
+        </w:tc>
+        <w:tc>
+          <w:tcPr>
+            <w:tcW w:type="dxa" w:w="6447"/>
+            <w:tcMar>
+              <w:top w:type="dxa" w:w="60"/>
+              <w:left w:type="dxa" w:w="90"/>
+              <w:bottom w:type="dxa" w:w="60"/>
+              <w:right w:type="dxa" w:w="90"/>
+            </w:tcMar>
+          </w:tcPr>
+          <w:p>
+            <w:pPr>
+              <w:spacing w:after="0" w:before="0"/>
+            </w:pPr>
+            <w:r>
+              <w:rPr>
+                <w:rFonts w:ascii="TH SarabunPSK" w:cs="TH SarabunPSK" w:eastAsia="TH SarabunPSK" w:hAnsi="TH SarabunPSK"/>
+                <w:b w:val="false"/>
+                <w:bCs w:val="false"/>
+                <w:sz w:val="27"/>
+                <w:szCs w:val="27"/>
+              </w:rPr>
+              <w:t xml:space="preserve">เลือกเฉพาะบางหมวดหรือบางรายการ ไม่ใช่สินค้าทั้งหมด</w:t>
+            </w:r>
+          </w:p>
+        </w:tc>
+      </w:tr>
+      <w:tr>
+        <w:tc>
+          <w:tcPr>
+            <w:tcW w:type="dxa" w:w="2579"/>
+            <w:tcMar>
+              <w:top w:type="dxa" w:w="60"/>
+              <w:left w:type="dxa" w:w="90"/>
+              <w:bottom w:type="dxa" w:w="60"/>
+              <w:right w:type="dxa" w:w="90"/>
+            </w:tcMar>
+          </w:tcPr>
+          <w:p>
+            <w:pPr>
+              <w:spacing w:after="0" w:before="0"/>
+            </w:pPr>
+            <w:r>
+              <w:rPr>
+                <w:rFonts w:ascii="TH SarabunPSK" w:cs="TH SarabunPSK" w:eastAsia="TH SarabunPSK" w:hAnsi="TH SarabunPSK"/>
+                <w:b w:val="false"/>
+                <w:bCs w:val="false"/>
+                <w:sz w:val="27"/>
+                <w:szCs w:val="27"/>
+              </w:rPr>
+              <w:t xml:space="preserve">เปอร์เซ็นต์ส่วนลด</w:t>
+            </w:r>
+          </w:p>
+        </w:tc>
+        <w:tc>
+          <w:tcPr>
+            <w:tcW w:type="dxa" w:w="6447"/>
+            <w:tcMar>
+              <w:top w:type="dxa" w:w="60"/>
+              <w:left w:type="dxa" w:w="90"/>
+              <w:bottom w:type="dxa" w:w="60"/>
+              <w:right w:type="dxa" w:w="90"/>
+            </w:tcMar>
+          </w:tcPr>
+          <w:p>
+            <w:pPr>
+              <w:spacing w:after="0" w:before="0"/>
+            </w:pPr>
+            <w:r>
+              <w:rPr>
+                <w:rFonts w:ascii="TH SarabunPSK" w:cs="TH SarabunPSK" w:eastAsia="TH SarabunPSK" w:hAnsi="TH SarabunPSK"/>
+                <w:b w:val="false"/>
+                <w:bCs w:val="false"/>
+                <w:sz w:val="27"/>
+                <w:szCs w:val="27"/>
+              </w:rPr>
+              <w:t xml:space="preserve">ตั้งแยกแต่ละกลุ่มสินค้าได้ เช่น กลุ่มหนึ่งลด 50% อีกกลุ่มลด 30%</w:t>
+            </w:r>
+          </w:p>
+        </w:tc>
+      </w:tr>
+      <w:tr>
+        <w:tc>
+          <w:tcPr>
+            <w:tcW w:type="dxa" w:w="2579"/>
+            <w:tcMar>
+              <w:top w:type="dxa" w:w="60"/>
+              <w:left w:type="dxa" w:w="90"/>
+              <w:bottom w:type="dxa" w:w="60"/>
+              <w:right w:type="dxa" w:w="90"/>
+            </w:tcMar>
+          </w:tcPr>
+          <w:p>
+            <w:pPr>
+              <w:spacing w:after="0" w:before="0"/>
+            </w:pPr>
+            <w:r>
+              <w:rPr>
+                <w:rFonts w:ascii="TH SarabunPSK" w:cs="TH SarabunPSK" w:eastAsia="TH SarabunPSK" w:hAnsi="TH SarabunPSK"/>
+                <w:b w:val="false"/>
+                <w:bCs w:val="false"/>
+                <w:sz w:val="27"/>
+                <w:szCs w:val="27"/>
+              </w:rPr>
+              <w:t xml:space="preserve">โควตาของรอบ</w:t>
+            </w:r>
+          </w:p>
+        </w:tc>
+        <w:tc>
+          <w:tcPr>
+            <w:tcW w:type="dxa" w:w="6447"/>
+            <w:tcMar>
+              <w:top w:type="dxa" w:w="60"/>
+              <w:left w:type="dxa" w:w="90"/>
+              <w:bottom w:type="dxa" w:w="60"/>
+              <w:right w:type="dxa" w:w="90"/>
+            </w:tcMar>
+          </w:tcPr>
+          <w:p>
+            <w:pPr>
+              <w:spacing w:after="0" w:before="0"/>
+            </w:pPr>
+            <w:r>
+              <w:rPr>
+                <w:rFonts w:ascii="TH SarabunPSK" w:cs="TH SarabunPSK" w:eastAsia="TH SarabunPSK" w:hAnsi="TH SarabunPSK"/>
+                <w:b w:val="false"/>
+                <w:bCs w:val="false"/>
+                <w:sz w:val="27"/>
+                <w:szCs w:val="27"/>
+              </w:rPr>
+              <w:t xml:space="preserve">จำกัดจำนวนชิ้นหรือยอดสูงสุดที่ขายได้ในราคาพิเศษ หมดโควตาราคากลับปกติทันที</w:t>
+            </w:r>
+          </w:p>
+        </w:tc>
+      </w:tr>
+    </w:tbl>
+    <w:p>
+      <w:pPr>
+        <w:spacing w:after="120"/>
+      </w:pPr>
+    </w:p>
     <w:p>
       <w:pPr>
         <w:keepNext/>
@@ -9546,6 +10432,323 @@
     </w:p>
     <w:p>
       <w:pPr>
+        <w:pStyle w:val="Heading3"/>
+        <w:keepNext/>
+        <w:spacing w:after="120" w:before="240"/>
+      </w:pPr>
+      <w:r>
+        <w:rPr>
+          <w:rFonts w:ascii="TH SarabunPSK" w:cs="TH SarabunPSK" w:eastAsia="TH SarabunPSK" w:hAnsi="TH SarabunPSK"/>
+          <w:b/>
+          <w:bCs/>
+          <w:color w:val="A32F34"/>
+          <w:sz w:val="32"/>
+          <w:szCs w:val="32"/>
+        </w:rPr>
+        <w:t xml:space="preserve">4.7 การตั้งค่าของแอดมิน</w:t>
+      </w:r>
+    </w:p>
+    <w:tbl>
+      <w:tblPr>
+        <w:tblW w:type="dxa" w:w="9026"/>
+        <w:tblBorders>
+          <w:top w:val="single" w:color="auto" w:sz="4"/>
+          <w:left w:val="single" w:color="auto" w:sz="4"/>
+          <w:bottom w:val="single" w:color="auto" w:sz="4"/>
+          <w:right w:val="single" w:color="auto" w:sz="4"/>
+          <w:insideH w:val="single" w:color="auto" w:sz="4"/>
+          <w:insideV w:val="single" w:color="auto" w:sz="4"/>
+        </w:tblBorders>
+      </w:tblPr>
+      <w:tblGrid>
+        <w:gridCol w:w="2801"/>
+        <w:gridCol w:w="6225"/>
+      </w:tblGrid>
+      <w:tr>
+        <w:trPr>
+          <w:tblHeader/>
+        </w:trPr>
+        <w:tc>
+          <w:tcPr>
+            <w:tcW w:type="dxa" w:w="2801"/>
+            <w:shd w:fill="A32F34" w:color="auto" w:val="clear"/>
+            <w:tcMar>
+              <w:top w:type="dxa" w:w="60"/>
+              <w:left w:type="dxa" w:w="90"/>
+              <w:bottom w:type="dxa" w:w="60"/>
+              <w:right w:type="dxa" w:w="90"/>
+            </w:tcMar>
+          </w:tcPr>
+          <w:p>
+            <w:pPr>
+              <w:spacing w:after="0" w:before="0"/>
+            </w:pPr>
+            <w:r>
+              <w:rPr>
+                <w:rFonts w:ascii="TH SarabunPSK" w:cs="TH SarabunPSK" w:eastAsia="TH SarabunPSK" w:hAnsi="TH SarabunPSK"/>
+                <w:b/>
+                <w:bCs/>
+                <w:color w:val="FFFFFF"/>
+                <w:sz w:val="27"/>
+                <w:szCs w:val="27"/>
+              </w:rPr>
+              <w:t xml:space="preserve">แบบคูปอง</w:t>
+            </w:r>
+          </w:p>
+        </w:tc>
+        <w:tc>
+          <w:tcPr>
+            <w:tcW w:type="dxa" w:w="6225"/>
+            <w:shd w:fill="A32F34" w:color="auto" w:val="clear"/>
+            <w:tcMar>
+              <w:top w:type="dxa" w:w="60"/>
+              <w:left w:type="dxa" w:w="90"/>
+              <w:bottom w:type="dxa" w:w="60"/>
+              <w:right w:type="dxa" w:w="90"/>
+            </w:tcMar>
+          </w:tcPr>
+          <w:p>
+            <w:pPr>
+              <w:spacing w:after="0" w:before="0"/>
+            </w:pPr>
+            <w:r>
+              <w:rPr>
+                <w:rFonts w:ascii="TH SarabunPSK" w:cs="TH SarabunPSK" w:eastAsia="TH SarabunPSK" w:hAnsi="TH SarabunPSK"/>
+                <w:b/>
+                <w:bCs/>
+                <w:color w:val="FFFFFF"/>
+                <w:sz w:val="27"/>
+                <w:szCs w:val="27"/>
+              </w:rPr>
+              <w:t xml:space="preserve">ตั้งค่าอะไรได้</w:t>
+            </w:r>
+          </w:p>
+        </w:tc>
+      </w:tr>
+      <w:tr>
+        <w:tc>
+          <w:tcPr>
+            <w:tcW w:type="dxa" w:w="2801"/>
+            <w:tcMar>
+              <w:top w:type="dxa" w:w="60"/>
+              <w:left w:type="dxa" w:w="90"/>
+              <w:bottom w:type="dxa" w:w="60"/>
+              <w:right w:type="dxa" w:w="90"/>
+            </w:tcMar>
+          </w:tcPr>
+          <w:p>
+            <w:pPr>
+              <w:spacing w:after="0" w:before="0"/>
+            </w:pPr>
+            <w:r>
+              <w:rPr>
+                <w:rFonts w:ascii="TH SarabunPSK" w:cs="TH SarabunPSK" w:eastAsia="TH SarabunPSK" w:hAnsi="TH SarabunPSK"/>
+                <w:b w:val="false"/>
+                <w:bCs w:val="false"/>
+                <w:sz w:val="27"/>
+                <w:szCs w:val="27"/>
+              </w:rPr>
+              <w:t xml:space="preserve">คูปองกระดาษ</w:t>
+            </w:r>
+          </w:p>
+        </w:tc>
+        <w:tc>
+          <w:tcPr>
+            <w:tcW w:type="dxa" w:w="6225"/>
+            <w:tcMar>
+              <w:top w:type="dxa" w:w="60"/>
+              <w:left w:type="dxa" w:w="90"/>
+              <w:bottom w:type="dxa" w:w="60"/>
+              <w:right w:type="dxa" w:w="90"/>
+            </w:tcMar>
+          </w:tcPr>
+          <w:p>
+            <w:pPr>
+              <w:spacing w:after="0" w:before="0"/>
+            </w:pPr>
+            <w:r>
+              <w:rPr>
+                <w:rFonts w:ascii="TH SarabunPSK" w:cs="TH SarabunPSK" w:eastAsia="TH SarabunPSK" w:hAnsi="TH SarabunPSK"/>
+                <w:b w:val="false"/>
+                <w:bCs w:val="false"/>
+                <w:sz w:val="27"/>
+                <w:szCs w:val="27"/>
+              </w:rPr>
+              <w:t xml:space="preserve">รหัสชุด จำนวนที่พิมพ์ มูลค่าส่วนลด เงื่อนไขยอดซื้อขั้นต่ำ และวันหมดอายุ</w:t>
+            </w:r>
+          </w:p>
+        </w:tc>
+      </w:tr>
+      <w:tr>
+        <w:tc>
+          <w:tcPr>
+            <w:tcW w:type="dxa" w:w="2801"/>
+            <w:tcMar>
+              <w:top w:type="dxa" w:w="60"/>
+              <w:left w:type="dxa" w:w="90"/>
+              <w:bottom w:type="dxa" w:w="60"/>
+              <w:right w:type="dxa" w:w="90"/>
+            </w:tcMar>
+          </w:tcPr>
+          <w:p>
+            <w:pPr>
+              <w:spacing w:after="0" w:before="0"/>
+            </w:pPr>
+            <w:r>
+              <w:rPr>
+                <w:rFonts w:ascii="TH SarabunPSK" w:cs="TH SarabunPSK" w:eastAsia="TH SarabunPSK" w:hAnsi="TH SarabunPSK"/>
+                <w:b w:val="false"/>
+                <w:bCs w:val="false"/>
+                <w:sz w:val="27"/>
+                <w:szCs w:val="27"/>
+              </w:rPr>
+              <w:t xml:space="preserve">คูปองออนไลน์ (โค้ดแชร์ได้)</w:t>
+            </w:r>
+          </w:p>
+        </w:tc>
+        <w:tc>
+          <w:tcPr>
+            <w:tcW w:type="dxa" w:w="6225"/>
+            <w:tcMar>
+              <w:top w:type="dxa" w:w="60"/>
+              <w:left w:type="dxa" w:w="90"/>
+              <w:bottom w:type="dxa" w:w="60"/>
+              <w:right w:type="dxa" w:w="90"/>
+            </w:tcMar>
+          </w:tcPr>
+          <w:p>
+            <w:pPr>
+              <w:spacing w:after="0" w:before="0"/>
+            </w:pPr>
+            <w:r>
+              <w:rPr>
+                <w:rFonts w:ascii="TH SarabunPSK" w:cs="TH SarabunPSK" w:eastAsia="TH SarabunPSK" w:hAnsi="TH SarabunPSK"/>
+                <w:b w:val="false"/>
+                <w:bCs w:val="false"/>
+                <w:sz w:val="27"/>
+                <w:szCs w:val="27"/>
+              </w:rPr>
+              <w:t xml:space="preserve">โค้ด มูลค่าหรือรูปแบบส่วนลด โควตาต่อคน โควตารวม ช่วงเวลาที่ใช้ได้ และสินค้าที่ยกเว้น</w:t>
+            </w:r>
+          </w:p>
+        </w:tc>
+      </w:tr>
+      <w:tr>
+        <w:tc>
+          <w:tcPr>
+            <w:tcW w:type="dxa" w:w="2801"/>
+            <w:tcMar>
+              <w:top w:type="dxa" w:w="60"/>
+              <w:left w:type="dxa" w:w="90"/>
+              <w:bottom w:type="dxa" w:w="60"/>
+              <w:right w:type="dxa" w:w="90"/>
+            </w:tcMar>
+          </w:tcPr>
+          <w:p>
+            <w:pPr>
+              <w:spacing w:after="0" w:before="0"/>
+            </w:pPr>
+            <w:r>
+              <w:rPr>
+                <w:rFonts w:ascii="TH SarabunPSK" w:cs="TH SarabunPSK" w:eastAsia="TH SarabunPSK" w:hAnsi="TH SarabunPSK"/>
+                <w:b w:val="false"/>
+                <w:bCs w:val="false"/>
+                <w:sz w:val="27"/>
+                <w:szCs w:val="27"/>
+              </w:rPr>
+              <w:t xml:space="preserve">คูปองเก็บเอง / แจกอัตโนมัติ</w:t>
+            </w:r>
+          </w:p>
+        </w:tc>
+        <w:tc>
+          <w:tcPr>
+            <w:tcW w:type="dxa" w:w="6225"/>
+            <w:tcMar>
+              <w:top w:type="dxa" w:w="60"/>
+              <w:left w:type="dxa" w:w="90"/>
+              <w:bottom w:type="dxa" w:w="60"/>
+              <w:right w:type="dxa" w:w="90"/>
+            </w:tcMar>
+          </w:tcPr>
+          <w:p>
+            <w:pPr>
+              <w:spacing w:after="0" w:before="0"/>
+            </w:pPr>
+            <w:r>
+              <w:rPr>
+                <w:rFonts w:ascii="TH SarabunPSK" w:cs="TH SarabunPSK" w:eastAsia="TH SarabunPSK" w:hAnsi="TH SarabunPSK"/>
+                <w:b w:val="false"/>
+                <w:bCs w:val="false"/>
+                <w:sz w:val="27"/>
+                <w:szCs w:val="27"/>
+              </w:rPr>
+              <w:t xml:space="preserve">เงื่อนไขส่วนลด สินค้าที่ยกเว้น โควตารวม วันหมดอายุ และเลือกโหมดแจก (เก็บเองหรือแจกอัตโนมัติทุกเดือน)</w:t>
+            </w:r>
+          </w:p>
+        </w:tc>
+      </w:tr>
+      <w:tr>
+        <w:tc>
+          <w:tcPr>
+            <w:tcW w:type="dxa" w:w="2801"/>
+            <w:tcMar>
+              <w:top w:type="dxa" w:w="60"/>
+              <w:left w:type="dxa" w:w="90"/>
+              <w:bottom w:type="dxa" w:w="60"/>
+              <w:right w:type="dxa" w:w="90"/>
+            </w:tcMar>
+          </w:tcPr>
+          <w:p>
+            <w:pPr>
+              <w:spacing w:after="0" w:before="0"/>
+            </w:pPr>
+            <w:r>
+              <w:rPr>
+                <w:rFonts w:ascii="TH SarabunPSK" w:cs="TH SarabunPSK" w:eastAsia="TH SarabunPSK" w:hAnsi="TH SarabunPSK"/>
+                <w:b w:val="false"/>
+                <w:bCs w:val="false"/>
+                <w:sz w:val="27"/>
+                <w:szCs w:val="27"/>
+              </w:rPr>
+              <w:t xml:space="preserve">คูปองลูกค้าใหม่</w:t>
+            </w:r>
+          </w:p>
+        </w:tc>
+        <w:tc>
+          <w:tcPr>
+            <w:tcW w:type="dxa" w:w="6225"/>
+            <w:tcMar>
+              <w:top w:type="dxa" w:w="60"/>
+              <w:left w:type="dxa" w:w="90"/>
+              <w:bottom w:type="dxa" w:w="60"/>
+              <w:right w:type="dxa" w:w="90"/>
+            </w:tcMar>
+          </w:tcPr>
+          <w:p>
+            <w:pPr>
+              <w:spacing w:after="0" w:before="0"/>
+            </w:pPr>
+            <w:r>
+              <w:rPr>
+                <w:rFonts w:ascii="TH SarabunPSK" w:cs="TH SarabunPSK" w:eastAsia="TH SarabunPSK" w:hAnsi="TH SarabunPSK"/>
+                <w:b w:val="false"/>
+                <w:bCs w:val="false"/>
+                <w:sz w:val="27"/>
+                <w:szCs w:val="27"/>
+              </w:rPr>
+              <w:t xml:space="preserve">ยอดซื้อขั้นต่ำ และมูลค่าส่วนลดต้อนรับ</w:t>
+            </w:r>
+          </w:p>
+        </w:tc>
+      </w:tr>
+    </w:tbl>
+    <w:p>
+      <w:pPr>
+        <w:spacing w:after="120"/>
+      </w:pPr>
+    </w:p>
+    <w:p>
+      <w:pPr>
         <w:pStyle w:val="Heading2"/>
         <w:pageBreakBefore/>
         <w:pBdr>
@@ -10859,6 +12062,377 @@
     </w:p>
     <w:p>
       <w:pPr>
+        <w:pStyle w:val="Heading3"/>
+        <w:keepNext/>
+        <w:spacing w:after="120" w:before="240"/>
+      </w:pPr>
+      <w:r>
+        <w:rPr>
+          <w:rFonts w:ascii="TH SarabunPSK" w:cs="TH SarabunPSK" w:eastAsia="TH SarabunPSK" w:hAnsi="TH SarabunPSK"/>
+          <w:b/>
+          <w:bCs/>
+          <w:color w:val="A32F34"/>
+          <w:sz w:val="32"/>
+          <w:szCs w:val="32"/>
+        </w:rPr>
+        <w:t xml:space="preserve">5.5 การตั้งค่าของแอดมิน</w:t>
+      </w:r>
+    </w:p>
+    <w:tbl>
+      <w:tblPr>
+        <w:tblW w:type="dxa" w:w="9026"/>
+        <w:tblBorders>
+          <w:top w:val="single" w:color="auto" w:sz="4"/>
+          <w:left w:val="single" w:color="auto" w:sz="4"/>
+          <w:bottom w:val="single" w:color="auto" w:sz="4"/>
+          <w:right w:val="single" w:color="auto" w:sz="4"/>
+          <w:insideH w:val="single" w:color="auto" w:sz="4"/>
+          <w:insideV w:val="single" w:color="auto" w:sz="4"/>
+        </w:tblBorders>
+      </w:tblPr>
+      <w:tblGrid>
+        <w:gridCol w:w="2083"/>
+        <w:gridCol w:w="6943"/>
+      </w:tblGrid>
+      <w:tr>
+        <w:trPr>
+          <w:tblHeader/>
+        </w:trPr>
+        <w:tc>
+          <w:tcPr>
+            <w:tcW w:type="dxa" w:w="2083"/>
+            <w:shd w:fill="A32F34" w:color="auto" w:val="clear"/>
+            <w:tcMar>
+              <w:top w:type="dxa" w:w="60"/>
+              <w:left w:type="dxa" w:w="90"/>
+              <w:bottom w:type="dxa" w:w="60"/>
+              <w:right w:type="dxa" w:w="90"/>
+            </w:tcMar>
+          </w:tcPr>
+          <w:p>
+            <w:pPr>
+              <w:spacing w:after="0" w:before="0"/>
+            </w:pPr>
+            <w:r>
+              <w:rPr>
+                <w:rFonts w:ascii="TH SarabunPSK" w:cs="TH SarabunPSK" w:eastAsia="TH SarabunPSK" w:hAnsi="TH SarabunPSK"/>
+                <w:b/>
+                <w:bCs/>
+                <w:color w:val="FFFFFF"/>
+                <w:sz w:val="27"/>
+                <w:szCs w:val="27"/>
+              </w:rPr>
+              <w:t xml:space="preserve">หัวข้อ</w:t>
+            </w:r>
+          </w:p>
+        </w:tc>
+        <w:tc>
+          <w:tcPr>
+            <w:tcW w:type="dxa" w:w="6943"/>
+            <w:shd w:fill="A32F34" w:color="auto" w:val="clear"/>
+            <w:tcMar>
+              <w:top w:type="dxa" w:w="60"/>
+              <w:left w:type="dxa" w:w="90"/>
+              <w:bottom w:type="dxa" w:w="60"/>
+              <w:right w:type="dxa" w:w="90"/>
+            </w:tcMar>
+          </w:tcPr>
+          <w:p>
+            <w:pPr>
+              <w:spacing w:after="0" w:before="0"/>
+            </w:pPr>
+            <w:r>
+              <w:rPr>
+                <w:rFonts w:ascii="TH SarabunPSK" w:cs="TH SarabunPSK" w:eastAsia="TH SarabunPSK" w:hAnsi="TH SarabunPSK"/>
+                <w:b/>
+                <w:bCs/>
+                <w:color w:val="FFFFFF"/>
+                <w:sz w:val="27"/>
+                <w:szCs w:val="27"/>
+              </w:rPr>
+              <w:t xml:space="preserve">รายละเอียด</w:t>
+            </w:r>
+          </w:p>
+        </w:tc>
+      </w:tr>
+      <w:tr>
+        <w:tc>
+          <w:tcPr>
+            <w:tcW w:type="dxa" w:w="2083"/>
+            <w:tcMar>
+              <w:top w:type="dxa" w:w="60"/>
+              <w:left w:type="dxa" w:w="90"/>
+              <w:bottom w:type="dxa" w:w="60"/>
+              <w:right w:type="dxa" w:w="90"/>
+            </w:tcMar>
+          </w:tcPr>
+          <w:p>
+            <w:pPr>
+              <w:spacing w:after="0" w:before="0"/>
+            </w:pPr>
+            <w:r>
+              <w:rPr>
+                <w:rFonts w:ascii="TH SarabunPSK" w:cs="TH SarabunPSK" w:eastAsia="TH SarabunPSK" w:hAnsi="TH SarabunPSK"/>
+                <w:b w:val="false"/>
+                <w:bCs w:val="false"/>
+                <w:sz w:val="27"/>
+                <w:szCs w:val="27"/>
+              </w:rPr>
+              <w:t xml:space="preserve">พอยท์ราย SKU</w:t>
+            </w:r>
+          </w:p>
+        </w:tc>
+        <w:tc>
+          <w:tcPr>
+            <w:tcW w:type="dxa" w:w="6943"/>
+            <w:tcMar>
+              <w:top w:type="dxa" w:w="60"/>
+              <w:left w:type="dxa" w:w="90"/>
+              <w:bottom w:type="dxa" w:w="60"/>
+              <w:right w:type="dxa" w:w="90"/>
+            </w:tcMar>
+          </w:tcPr>
+          <w:p>
+            <w:pPr>
+              <w:spacing w:after="0" w:before="0"/>
+            </w:pPr>
+            <w:r>
+              <w:rPr>
+                <w:rFonts w:ascii="TH SarabunPSK" w:cs="TH SarabunPSK" w:eastAsia="TH SarabunPSK" w:hAnsi="TH SarabunPSK"/>
+                <w:b w:val="false"/>
+                <w:bCs w:val="false"/>
+                <w:sz w:val="27"/>
+                <w:szCs w:val="27"/>
+              </w:rPr>
+              <w:t xml:space="preserve">ตั้งพอยท์ต่อหน่วยของสินค้าแต่ละรายการเอง ปิดเป็น 0 พอยท์ได้</w:t>
+            </w:r>
+          </w:p>
+        </w:tc>
+      </w:tr>
+      <w:tr>
+        <w:tc>
+          <w:tcPr>
+            <w:tcW w:type="dxa" w:w="2083"/>
+            <w:tcMar>
+              <w:top w:type="dxa" w:w="60"/>
+              <w:left w:type="dxa" w:w="90"/>
+              <w:bottom w:type="dxa" w:w="60"/>
+              <w:right w:type="dxa" w:w="90"/>
+            </w:tcMar>
+          </w:tcPr>
+          <w:p>
+            <w:pPr>
+              <w:spacing w:after="0" w:before="0"/>
+            </w:pPr>
+            <w:r>
+              <w:rPr>
+                <w:rFonts w:ascii="TH SarabunPSK" w:cs="TH SarabunPSK" w:eastAsia="TH SarabunPSK" w:hAnsi="TH SarabunPSK"/>
+                <w:b w:val="false"/>
+                <w:bCs w:val="false"/>
+                <w:sz w:val="27"/>
+                <w:szCs w:val="27"/>
+              </w:rPr>
+              <w:t xml:space="preserve">ตัวคูณแคมเปญ</w:t>
+            </w:r>
+          </w:p>
+        </w:tc>
+        <w:tc>
+          <w:tcPr>
+            <w:tcW w:type="dxa" w:w="6943"/>
+            <w:tcMar>
+              <w:top w:type="dxa" w:w="60"/>
+              <w:left w:type="dxa" w:w="90"/>
+              <w:bottom w:type="dxa" w:w="60"/>
+              <w:right w:type="dxa" w:w="90"/>
+            </w:tcMar>
+          </w:tcPr>
+          <w:p>
+            <w:pPr>
+              <w:spacing w:after="0" w:before="0"/>
+            </w:pPr>
+            <w:r>
+              <w:rPr>
+                <w:rFonts w:ascii="TH SarabunPSK" w:cs="TH SarabunPSK" w:eastAsia="TH SarabunPSK" w:hAnsi="TH SarabunPSK"/>
+                <w:b w:val="false"/>
+                <w:bCs w:val="false"/>
+                <w:sz w:val="27"/>
+                <w:szCs w:val="27"/>
+              </w:rPr>
+              <w:t xml:space="preserve">ตั้งตัวคูณพอยท์พิเศษสำหรับช่วงแคมเปญ</w:t>
+            </w:r>
+          </w:p>
+        </w:tc>
+      </w:tr>
+      <w:tr>
+        <w:tc>
+          <w:tcPr>
+            <w:tcW w:type="dxa" w:w="2083"/>
+            <w:tcMar>
+              <w:top w:type="dxa" w:w="60"/>
+              <w:left w:type="dxa" w:w="90"/>
+              <w:bottom w:type="dxa" w:w="60"/>
+              <w:right w:type="dxa" w:w="90"/>
+            </w:tcMar>
+          </w:tcPr>
+          <w:p>
+            <w:pPr>
+              <w:spacing w:after="0" w:before="0"/>
+            </w:pPr>
+            <w:r>
+              <w:rPr>
+                <w:rFonts w:ascii="TH SarabunPSK" w:cs="TH SarabunPSK" w:eastAsia="TH SarabunPSK" w:hAnsi="TH SarabunPSK"/>
+                <w:b w:val="false"/>
+                <w:bCs w:val="false"/>
+                <w:sz w:val="27"/>
+                <w:szCs w:val="27"/>
+              </w:rPr>
+              <w:t xml:space="preserve">รายการแลกของรางวัล</w:t>
+            </w:r>
+          </w:p>
+        </w:tc>
+        <w:tc>
+          <w:tcPr>
+            <w:tcW w:type="dxa" w:w="6943"/>
+            <w:tcMar>
+              <w:top w:type="dxa" w:w="60"/>
+              <w:left w:type="dxa" w:w="90"/>
+              <w:bottom w:type="dxa" w:w="60"/>
+              <w:right w:type="dxa" w:w="90"/>
+            </w:tcMar>
+          </w:tcPr>
+          <w:p>
+            <w:pPr>
+              <w:spacing w:after="0" w:before="0"/>
+            </w:pPr>
+            <w:r>
+              <w:rPr>
+                <w:rFonts w:ascii="TH SarabunPSK" w:cs="TH SarabunPSK" w:eastAsia="TH SarabunPSK" w:hAnsi="TH SarabunPSK"/>
+                <w:b w:val="false"/>
+                <w:bCs w:val="false"/>
+                <w:sz w:val="27"/>
+                <w:szCs w:val="27"/>
+              </w:rPr>
+              <w:t xml:space="preserve">เพิ่ม ลบ หรือแก้ไขของรางวัล และกำหนดจำนวนพอยท์ที่ใช้แลกแต่ละรายการ</w:t>
+            </w:r>
+          </w:p>
+        </w:tc>
+      </w:tr>
+      <w:tr>
+        <w:tc>
+          <w:tcPr>
+            <w:tcW w:type="dxa" w:w="2083"/>
+            <w:tcMar>
+              <w:top w:type="dxa" w:w="60"/>
+              <w:left w:type="dxa" w:w="90"/>
+              <w:bottom w:type="dxa" w:w="60"/>
+              <w:right w:type="dxa" w:w="90"/>
+            </w:tcMar>
+          </w:tcPr>
+          <w:p>
+            <w:pPr>
+              <w:spacing w:after="0" w:before="0"/>
+            </w:pPr>
+            <w:r>
+              <w:rPr>
+                <w:rFonts w:ascii="TH SarabunPSK" w:cs="TH SarabunPSK" w:eastAsia="TH SarabunPSK" w:hAnsi="TH SarabunPSK"/>
+                <w:b w:val="false"/>
+                <w:bCs w:val="false"/>
+                <w:sz w:val="27"/>
+                <w:szCs w:val="27"/>
+              </w:rPr>
+              <w:t xml:space="preserve">แคมเปญตามช่วงเวลา</w:t>
+            </w:r>
+          </w:p>
+        </w:tc>
+        <w:tc>
+          <w:tcPr>
+            <w:tcW w:type="dxa" w:w="6943"/>
+            <w:tcMar>
+              <w:top w:type="dxa" w:w="60"/>
+              <w:left w:type="dxa" w:w="90"/>
+              <w:bottom w:type="dxa" w:w="60"/>
+              <w:right w:type="dxa" w:w="90"/>
+            </w:tcMar>
+          </w:tcPr>
+          <w:p>
+            <w:pPr>
+              <w:spacing w:after="0" w:before="0"/>
+            </w:pPr>
+            <w:r>
+              <w:rPr>
+                <w:rFonts w:ascii="TH SarabunPSK" w:cs="TH SarabunPSK" w:eastAsia="TH SarabunPSK" w:hAnsi="TH SarabunPSK"/>
+                <w:b w:val="false"/>
+                <w:bCs w:val="false"/>
+                <w:sz w:val="27"/>
+                <w:szCs w:val="27"/>
+              </w:rPr>
+              <w:t xml:space="preserve">ผูก SKU ที่เข้าร่วม ตั้งช่วงเวลา และโควตารวม / โควตาต่อร้านค้า (รายละเอียดหัวข้อ 5.3)</w:t>
+            </w:r>
+          </w:p>
+        </w:tc>
+      </w:tr>
+      <w:tr>
+        <w:tc>
+          <w:tcPr>
+            <w:tcW w:type="dxa" w:w="2083"/>
+            <w:tcMar>
+              <w:top w:type="dxa" w:w="60"/>
+              <w:left w:type="dxa" w:w="90"/>
+              <w:bottom w:type="dxa" w:w="60"/>
+              <w:right w:type="dxa" w:w="90"/>
+            </w:tcMar>
+          </w:tcPr>
+          <w:p>
+            <w:pPr>
+              <w:spacing w:after="0" w:before="0"/>
+            </w:pPr>
+            <w:r>
+              <w:rPr>
+                <w:rFonts w:ascii="TH SarabunPSK" w:cs="TH SarabunPSK" w:eastAsia="TH SarabunPSK" w:hAnsi="TH SarabunPSK"/>
+                <w:b w:val="false"/>
+                <w:bCs w:val="false"/>
+                <w:sz w:val="27"/>
+                <w:szCs w:val="27"/>
+              </w:rPr>
+              <w:t xml:space="preserve">แคมเปญสะสมยอดรายปี</w:t>
+            </w:r>
+          </w:p>
+        </w:tc>
+        <w:tc>
+          <w:tcPr>
+            <w:tcW w:type="dxa" w:w="6943"/>
+            <w:tcMar>
+              <w:top w:type="dxa" w:w="60"/>
+              <w:left w:type="dxa" w:w="90"/>
+              <w:bottom w:type="dxa" w:w="60"/>
+              <w:right w:type="dxa" w:w="90"/>
+            </w:tcMar>
+          </w:tcPr>
+          <w:p>
+            <w:pPr>
+              <w:spacing w:after="0" w:before="0"/>
+            </w:pPr>
+            <w:r>
+              <w:rPr>
+                <w:rFonts w:ascii="TH SarabunPSK" w:cs="TH SarabunPSK" w:eastAsia="TH SarabunPSK" w:hAnsi="TH SarabunPSK"/>
+                <w:b w:val="false"/>
+                <w:bCs w:val="false"/>
+                <w:sz w:val="27"/>
+                <w:szCs w:val="27"/>
+              </w:rPr>
+              <w:t xml:space="preserve">ตั้งเกณฑ์ยอดสะสมแต่ละขั้น ของรางวัล (รวมของที่ไม่อยู่ใน POS) และออกแบบฟอร์มขอข้อมูลตอนรับสิทธิ์เอง</w:t>
+            </w:r>
+          </w:p>
+        </w:tc>
+      </w:tr>
+    </w:tbl>
+    <w:p>
+      <w:pPr>
+        <w:spacing w:after="120"/>
+      </w:pPr>
+    </w:p>
+    <w:p>
+      <w:pPr>
         <w:pStyle w:val="Heading2"/>
         <w:pageBreakBefore/>
         <w:pBdr>
@@ -12856,6 +14430,323 @@
     </w:p>
     <w:p>
       <w:pPr>
+        <w:pStyle w:val="Heading3"/>
+        <w:keepNext/>
+        <w:spacing w:after="120" w:before="240"/>
+      </w:pPr>
+      <w:r>
+        <w:rPr>
+          <w:rFonts w:ascii="TH SarabunPSK" w:cs="TH SarabunPSK" w:eastAsia="TH SarabunPSK" w:hAnsi="TH SarabunPSK"/>
+          <w:b/>
+          <w:bCs/>
+          <w:color w:val="A32F34"/>
+          <w:sz w:val="32"/>
+          <w:szCs w:val="32"/>
+        </w:rPr>
+        <w:t xml:space="preserve">6.9 การตั้งค่าของแอดมิน</w:t>
+      </w:r>
+    </w:p>
+    <w:tbl>
+      <w:tblPr>
+        <w:tblW w:type="dxa" w:w="9026"/>
+        <w:tblBorders>
+          <w:top w:val="single" w:color="auto" w:sz="4"/>
+          <w:left w:val="single" w:color="auto" w:sz="4"/>
+          <w:bottom w:val="single" w:color="auto" w:sz="4"/>
+          <w:right w:val="single" w:color="auto" w:sz="4"/>
+          <w:insideH w:val="single" w:color="auto" w:sz="4"/>
+          <w:insideV w:val="single" w:color="auto" w:sz="4"/>
+        </w:tblBorders>
+      </w:tblPr>
+      <w:tblGrid>
+        <w:gridCol w:w="2257"/>
+        <w:gridCol w:w="6769"/>
+      </w:tblGrid>
+      <w:tr>
+        <w:trPr>
+          <w:tblHeader/>
+        </w:trPr>
+        <w:tc>
+          <w:tcPr>
+            <w:tcW w:type="dxa" w:w="2257"/>
+            <w:shd w:fill="A32F34" w:color="auto" w:val="clear"/>
+            <w:tcMar>
+              <w:top w:type="dxa" w:w="60"/>
+              <w:left w:type="dxa" w:w="90"/>
+              <w:bottom w:type="dxa" w:w="60"/>
+              <w:right w:type="dxa" w:w="90"/>
+            </w:tcMar>
+          </w:tcPr>
+          <w:p>
+            <w:pPr>
+              <w:spacing w:after="0" w:before="0"/>
+            </w:pPr>
+            <w:r>
+              <w:rPr>
+                <w:rFonts w:ascii="TH SarabunPSK" w:cs="TH SarabunPSK" w:eastAsia="TH SarabunPSK" w:hAnsi="TH SarabunPSK"/>
+                <w:b/>
+                <w:bCs/>
+                <w:color w:val="FFFFFF"/>
+                <w:sz w:val="27"/>
+                <w:szCs w:val="27"/>
+              </w:rPr>
+              <w:t xml:space="preserve">หัวข้อ</w:t>
+            </w:r>
+          </w:p>
+        </w:tc>
+        <w:tc>
+          <w:tcPr>
+            <w:tcW w:type="dxa" w:w="6769"/>
+            <w:shd w:fill="A32F34" w:color="auto" w:val="clear"/>
+            <w:tcMar>
+              <w:top w:type="dxa" w:w="60"/>
+              <w:left w:type="dxa" w:w="90"/>
+              <w:bottom w:type="dxa" w:w="60"/>
+              <w:right w:type="dxa" w:w="90"/>
+            </w:tcMar>
+          </w:tcPr>
+          <w:p>
+            <w:pPr>
+              <w:spacing w:after="0" w:before="0"/>
+            </w:pPr>
+            <w:r>
+              <w:rPr>
+                <w:rFonts w:ascii="TH SarabunPSK" w:cs="TH SarabunPSK" w:eastAsia="TH SarabunPSK" w:hAnsi="TH SarabunPSK"/>
+                <w:b/>
+                <w:bCs/>
+                <w:color w:val="FFFFFF"/>
+                <w:sz w:val="27"/>
+                <w:szCs w:val="27"/>
+              </w:rPr>
+              <w:t xml:space="preserve">รายละเอียด</w:t>
+            </w:r>
+          </w:p>
+        </w:tc>
+      </w:tr>
+      <w:tr>
+        <w:tc>
+          <w:tcPr>
+            <w:tcW w:type="dxa" w:w="2257"/>
+            <w:tcMar>
+              <w:top w:type="dxa" w:w="60"/>
+              <w:left w:type="dxa" w:w="90"/>
+              <w:bottom w:type="dxa" w:w="60"/>
+              <w:right w:type="dxa" w:w="90"/>
+            </w:tcMar>
+          </w:tcPr>
+          <w:p>
+            <w:pPr>
+              <w:spacing w:after="0" w:before="0"/>
+            </w:pPr>
+            <w:r>
+              <w:rPr>
+                <w:rFonts w:ascii="TH SarabunPSK" w:cs="TH SarabunPSK" w:eastAsia="TH SarabunPSK" w:hAnsi="TH SarabunPSK"/>
+                <w:b w:val="false"/>
+                <w:bCs w:val="false"/>
+                <w:sz w:val="27"/>
+                <w:szCs w:val="27"/>
+              </w:rPr>
+              <w:t xml:space="preserve">ทางเข้าของสิทธิ์ลุ้น</w:t>
+            </w:r>
+          </w:p>
+        </w:tc>
+        <w:tc>
+          <w:tcPr>
+            <w:tcW w:type="dxa" w:w="6769"/>
+            <w:tcMar>
+              <w:top w:type="dxa" w:w="60"/>
+              <w:left w:type="dxa" w:w="90"/>
+              <w:bottom w:type="dxa" w:w="60"/>
+              <w:right w:type="dxa" w:w="90"/>
+            </w:tcMar>
+          </w:tcPr>
+          <w:p>
+            <w:pPr>
+              <w:spacing w:after="0" w:before="0"/>
+            </w:pPr>
+            <w:r>
+              <w:rPr>
+                <w:rFonts w:ascii="TH SarabunPSK" w:cs="TH SarabunPSK" w:eastAsia="TH SarabunPSK" w:hAnsi="TH SarabunPSK"/>
+                <w:b w:val="false"/>
+                <w:bCs w:val="false"/>
+                <w:sz w:val="27"/>
+                <w:szCs w:val="27"/>
+              </w:rPr>
+              <w:t xml:space="preserve">เปิดหรือปิดได้ทีละทาง (แลกพอยท์ ยอดซื้อ สินค้าร่วมรายการ ขั้นแคมเปญ โค้ดในกล่อง) และตั้งอัตราแลกของแต่ละทาง เช่น กี่พอยท์ หรือกี่บาท ต่อ 1 สิทธิ์</w:t>
+            </w:r>
+          </w:p>
+        </w:tc>
+      </w:tr>
+      <w:tr>
+        <w:tc>
+          <w:tcPr>
+            <w:tcW w:type="dxa" w:w="2257"/>
+            <w:tcMar>
+              <w:top w:type="dxa" w:w="60"/>
+              <w:left w:type="dxa" w:w="90"/>
+              <w:bottom w:type="dxa" w:w="60"/>
+              <w:right w:type="dxa" w:w="90"/>
+            </w:tcMar>
+          </w:tcPr>
+          <w:p>
+            <w:pPr>
+              <w:spacing w:after="0" w:before="0"/>
+            </w:pPr>
+            <w:r>
+              <w:rPr>
+                <w:rFonts w:ascii="TH SarabunPSK" w:cs="TH SarabunPSK" w:eastAsia="TH SarabunPSK" w:hAnsi="TH SarabunPSK"/>
+                <w:b w:val="false"/>
+                <w:bCs w:val="false"/>
+                <w:sz w:val="27"/>
+                <w:szCs w:val="27"/>
+              </w:rPr>
+              <w:t xml:space="preserve">รางวัลและน้ำหนัก</w:t>
+            </w:r>
+          </w:p>
+        </w:tc>
+        <w:tc>
+          <w:tcPr>
+            <w:tcW w:type="dxa" w:w="6769"/>
+            <w:tcMar>
+              <w:top w:type="dxa" w:w="60"/>
+              <w:left w:type="dxa" w:w="90"/>
+              <w:bottom w:type="dxa" w:w="60"/>
+              <w:right w:type="dxa" w:w="90"/>
+            </w:tcMar>
+          </w:tcPr>
+          <w:p>
+            <w:pPr>
+              <w:spacing w:after="0" w:before="0"/>
+            </w:pPr>
+            <w:r>
+              <w:rPr>
+                <w:rFonts w:ascii="TH SarabunPSK" w:cs="TH SarabunPSK" w:eastAsia="TH SarabunPSK" w:hAnsi="TH SarabunPSK"/>
+                <w:b w:val="false"/>
+                <w:bCs w:val="false"/>
+                <w:sz w:val="27"/>
+                <w:szCs w:val="27"/>
+              </w:rPr>
+              <w:t xml:space="preserve">เพิ่มรายการรางวัล กรอกน้ำหนัก จำนวนจำกัด และมูลค่าต่อรางวัล (รายละเอียดหัวข้อ 6.4)</w:t>
+            </w:r>
+          </w:p>
+        </w:tc>
+      </w:tr>
+      <w:tr>
+        <w:tc>
+          <w:tcPr>
+            <w:tcW w:type="dxa" w:w="2257"/>
+            <w:tcMar>
+              <w:top w:type="dxa" w:w="60"/>
+              <w:left w:type="dxa" w:w="90"/>
+              <w:bottom w:type="dxa" w:w="60"/>
+              <w:right w:type="dxa" w:w="90"/>
+            </w:tcMar>
+          </w:tcPr>
+          <w:p>
+            <w:pPr>
+              <w:spacing w:after="0" w:before="0"/>
+            </w:pPr>
+            <w:r>
+              <w:rPr>
+                <w:rFonts w:ascii="TH SarabunPSK" w:cs="TH SarabunPSK" w:eastAsia="TH SarabunPSK" w:hAnsi="TH SarabunPSK"/>
+                <w:b w:val="false"/>
+                <w:bCs w:val="false"/>
+                <w:sz w:val="27"/>
+                <w:szCs w:val="27"/>
+              </w:rPr>
+              <w:t xml:space="preserve">ตัวคุมงบ</w:t>
+            </w:r>
+          </w:p>
+        </w:tc>
+        <w:tc>
+          <w:tcPr>
+            <w:tcW w:type="dxa" w:w="6769"/>
+            <w:tcMar>
+              <w:top w:type="dxa" w:w="60"/>
+              <w:left w:type="dxa" w:w="90"/>
+              <w:bottom w:type="dxa" w:w="60"/>
+              <w:right w:type="dxa" w:w="90"/>
+            </w:tcMar>
+          </w:tcPr>
+          <w:p>
+            <w:pPr>
+              <w:spacing w:after="0" w:before="0"/>
+            </w:pPr>
+            <w:r>
+              <w:rPr>
+                <w:rFonts w:ascii="TH SarabunPSK" w:cs="TH SarabunPSK" w:eastAsia="TH SarabunPSK" w:hAnsi="TH SarabunPSK"/>
+                <w:b w:val="false"/>
+                <w:bCs w:val="false"/>
+                <w:sz w:val="27"/>
+                <w:szCs w:val="27"/>
+              </w:rPr>
+              <w:t xml:space="preserve">เพดานงบต่อรอบหรือต่อวัน เพดานการถูกรางวัลต่อคนต่อรอบ และของปลอบใจการันตี</w:t>
+            </w:r>
+          </w:p>
+        </w:tc>
+      </w:tr>
+      <w:tr>
+        <w:tc>
+          <w:tcPr>
+            <w:tcW w:type="dxa" w:w="2257"/>
+            <w:tcMar>
+              <w:top w:type="dxa" w:w="60"/>
+              <w:left w:type="dxa" w:w="90"/>
+              <w:bottom w:type="dxa" w:w="60"/>
+              <w:right w:type="dxa" w:w="90"/>
+            </w:tcMar>
+          </w:tcPr>
+          <w:p>
+            <w:pPr>
+              <w:spacing w:after="0" w:before="0"/>
+            </w:pPr>
+            <w:r>
+              <w:rPr>
+                <w:rFonts w:ascii="TH SarabunPSK" w:cs="TH SarabunPSK" w:eastAsia="TH SarabunPSK" w:hAnsi="TH SarabunPSK"/>
+                <w:b w:val="false"/>
+                <w:bCs w:val="false"/>
+                <w:sz w:val="27"/>
+                <w:szCs w:val="27"/>
+              </w:rPr>
+              <w:t xml:space="preserve">โหมดการจับ</w:t>
+            </w:r>
+          </w:p>
+        </w:tc>
+        <w:tc>
+          <w:tcPr>
+            <w:tcW w:type="dxa" w:w="6769"/>
+            <w:tcMar>
+              <w:top w:type="dxa" w:w="60"/>
+              <w:left w:type="dxa" w:w="90"/>
+              <w:bottom w:type="dxa" w:w="60"/>
+              <w:right w:type="dxa" w:w="90"/>
+            </w:tcMar>
+          </w:tcPr>
+          <w:p>
+            <w:pPr>
+              <w:spacing w:after="0" w:before="0"/>
+            </w:pPr>
+            <w:r>
+              <w:rPr>
+                <w:rFonts w:ascii="TH SarabunPSK" w:cs="TH SarabunPSK" w:eastAsia="TH SarabunPSK" w:hAnsi="TH SarabunPSK"/>
+                <w:b w:val="false"/>
+                <w:bCs w:val="false"/>
+                <w:sz w:val="27"/>
+                <w:szCs w:val="27"/>
+              </w:rPr>
+              <w:t xml:space="preserve">เลือกต่อรางวัลว่าใช้โหมดลุ้นทันทีหรือจับตามรอบ</w:t>
+            </w:r>
+          </w:p>
+        </w:tc>
+      </w:tr>
+    </w:tbl>
+    <w:p>
+      <w:pPr>
+        <w:spacing w:after="120"/>
+      </w:pPr>
+    </w:p>
+    <w:p>
+      <w:pPr>
         <w:pStyle w:val="Heading2"/>
         <w:pageBreakBefore/>
         <w:pBdr>
@@ -13470,6 +15361,323 @@
         </w:rPr>
         <w:t xml:space="preserve">26,500 บาท</w:t>
       </w:r>
+    </w:p>
+    <w:p>
+      <w:pPr>
+        <w:pStyle w:val="Heading3"/>
+        <w:keepNext/>
+        <w:spacing w:after="120" w:before="240"/>
+      </w:pPr>
+      <w:r>
+        <w:rPr>
+          <w:rFonts w:ascii="TH SarabunPSK" w:cs="TH SarabunPSK" w:eastAsia="TH SarabunPSK" w:hAnsi="TH SarabunPSK"/>
+          <w:b/>
+          <w:bCs/>
+          <w:color w:val="A32F34"/>
+          <w:sz w:val="32"/>
+          <w:szCs w:val="32"/>
+        </w:rPr>
+        <w:t xml:space="preserve">7.4 การตั้งค่าของแอดมิน</w:t>
+      </w:r>
+    </w:p>
+    <w:tbl>
+      <w:tblPr>
+        <w:tblW w:type="dxa" w:w="9026"/>
+        <w:tblBorders>
+          <w:top w:val="single" w:color="auto" w:sz="4"/>
+          <w:left w:val="single" w:color="auto" w:sz="4"/>
+          <w:bottom w:val="single" w:color="auto" w:sz="4"/>
+          <w:right w:val="single" w:color="auto" w:sz="4"/>
+          <w:insideH w:val="single" w:color="auto" w:sz="4"/>
+          <w:insideV w:val="single" w:color="auto" w:sz="4"/>
+        </w:tblBorders>
+      </w:tblPr>
+      <w:tblGrid>
+        <w:gridCol w:w="2298"/>
+        <w:gridCol w:w="6728"/>
+      </w:tblGrid>
+      <w:tr>
+        <w:trPr>
+          <w:tblHeader/>
+        </w:trPr>
+        <w:tc>
+          <w:tcPr>
+            <w:tcW w:type="dxa" w:w="2298"/>
+            <w:shd w:fill="A32F34" w:color="auto" w:val="clear"/>
+            <w:tcMar>
+              <w:top w:type="dxa" w:w="60"/>
+              <w:left w:type="dxa" w:w="90"/>
+              <w:bottom w:type="dxa" w:w="60"/>
+              <w:right w:type="dxa" w:w="90"/>
+            </w:tcMar>
+          </w:tcPr>
+          <w:p>
+            <w:pPr>
+              <w:spacing w:after="0" w:before="0"/>
+            </w:pPr>
+            <w:r>
+              <w:rPr>
+                <w:rFonts w:ascii="TH SarabunPSK" w:cs="TH SarabunPSK" w:eastAsia="TH SarabunPSK" w:hAnsi="TH SarabunPSK"/>
+                <w:b/>
+                <w:bCs/>
+                <w:color w:val="FFFFFF"/>
+                <w:sz w:val="27"/>
+                <w:szCs w:val="27"/>
+              </w:rPr>
+              <w:t xml:space="preserve">หัวข้อ</w:t>
+            </w:r>
+          </w:p>
+        </w:tc>
+        <w:tc>
+          <w:tcPr>
+            <w:tcW w:type="dxa" w:w="6728"/>
+            <w:shd w:fill="A32F34" w:color="auto" w:val="clear"/>
+            <w:tcMar>
+              <w:top w:type="dxa" w:w="60"/>
+              <w:left w:type="dxa" w:w="90"/>
+              <w:bottom w:type="dxa" w:w="60"/>
+              <w:right w:type="dxa" w:w="90"/>
+            </w:tcMar>
+          </w:tcPr>
+          <w:p>
+            <w:pPr>
+              <w:spacing w:after="0" w:before="0"/>
+            </w:pPr>
+            <w:r>
+              <w:rPr>
+                <w:rFonts w:ascii="TH SarabunPSK" w:cs="TH SarabunPSK" w:eastAsia="TH SarabunPSK" w:hAnsi="TH SarabunPSK"/>
+                <w:b/>
+                <w:bCs/>
+                <w:color w:val="FFFFFF"/>
+                <w:sz w:val="27"/>
+                <w:szCs w:val="27"/>
+              </w:rPr>
+              <w:t xml:space="preserve">รายละเอียด</w:t>
+            </w:r>
+          </w:p>
+        </w:tc>
+      </w:tr>
+      <w:tr>
+        <w:tc>
+          <w:tcPr>
+            <w:tcW w:type="dxa" w:w="2298"/>
+            <w:tcMar>
+              <w:top w:type="dxa" w:w="60"/>
+              <w:left w:type="dxa" w:w="90"/>
+              <w:bottom w:type="dxa" w:w="60"/>
+              <w:right w:type="dxa" w:w="90"/>
+            </w:tcMar>
+          </w:tcPr>
+          <w:p>
+            <w:pPr>
+              <w:spacing w:after="0" w:before="0"/>
+            </w:pPr>
+            <w:r>
+              <w:rPr>
+                <w:rFonts w:ascii="TH SarabunPSK" w:cs="TH SarabunPSK" w:eastAsia="TH SarabunPSK" w:hAnsi="TH SarabunPSK"/>
+                <w:b w:val="false"/>
+                <w:bCs w:val="false"/>
+                <w:sz w:val="27"/>
+                <w:szCs w:val="27"/>
+              </w:rPr>
+              <w:t xml:space="preserve">ข้อมูลเซต</w:t>
+            </w:r>
+          </w:p>
+        </w:tc>
+        <w:tc>
+          <w:tcPr>
+            <w:tcW w:type="dxa" w:w="6728"/>
+            <w:tcMar>
+              <w:top w:type="dxa" w:w="60"/>
+              <w:left w:type="dxa" w:w="90"/>
+              <w:bottom w:type="dxa" w:w="60"/>
+              <w:right w:type="dxa" w:w="90"/>
+            </w:tcMar>
+          </w:tcPr>
+          <w:p>
+            <w:pPr>
+              <w:spacing w:after="0" w:before="0"/>
+            </w:pPr>
+            <w:r>
+              <w:rPr>
+                <w:rFonts w:ascii="TH SarabunPSK" w:cs="TH SarabunPSK" w:eastAsia="TH SarabunPSK" w:hAnsi="TH SarabunPSK"/>
+                <w:b w:val="false"/>
+                <w:bCs w:val="false"/>
+                <w:sz w:val="27"/>
+                <w:szCs w:val="27"/>
+              </w:rPr>
+              <w:t xml:space="preserve">ชื่อเซต คำอธิบาย และเปิด/ปิดการขาย</w:t>
+            </w:r>
+          </w:p>
+        </w:tc>
+      </w:tr>
+      <w:tr>
+        <w:tc>
+          <w:tcPr>
+            <w:tcW w:type="dxa" w:w="2298"/>
+            <w:tcMar>
+              <w:top w:type="dxa" w:w="60"/>
+              <w:left w:type="dxa" w:w="90"/>
+              <w:bottom w:type="dxa" w:w="60"/>
+              <w:right w:type="dxa" w:w="90"/>
+            </w:tcMar>
+          </w:tcPr>
+          <w:p>
+            <w:pPr>
+              <w:spacing w:after="0" w:before="0"/>
+            </w:pPr>
+            <w:r>
+              <w:rPr>
+                <w:rFonts w:ascii="TH SarabunPSK" w:cs="TH SarabunPSK" w:eastAsia="TH SarabunPSK" w:hAnsi="TH SarabunPSK"/>
+                <w:b w:val="false"/>
+                <w:bCs w:val="false"/>
+                <w:sz w:val="27"/>
+                <w:szCs w:val="27"/>
+              </w:rPr>
+              <w:t xml:space="preserve">สินค้าบังคับ</w:t>
+            </w:r>
+          </w:p>
+        </w:tc>
+        <w:tc>
+          <w:tcPr>
+            <w:tcW w:type="dxa" w:w="6728"/>
+            <w:tcMar>
+              <w:top w:type="dxa" w:w="60"/>
+              <w:left w:type="dxa" w:w="90"/>
+              <w:bottom w:type="dxa" w:w="60"/>
+              <w:right w:type="dxa" w:w="90"/>
+            </w:tcMar>
+          </w:tcPr>
+          <w:p>
+            <w:pPr>
+              <w:spacing w:after="0" w:before="0"/>
+            </w:pPr>
+            <w:r>
+              <w:rPr>
+                <w:rFonts w:ascii="TH SarabunPSK" w:cs="TH SarabunPSK" w:eastAsia="TH SarabunPSK" w:hAnsi="TH SarabunPSK"/>
+                <w:b w:val="false"/>
+                <w:bCs w:val="false"/>
+                <w:sz w:val="27"/>
+                <w:szCs w:val="27"/>
+              </w:rPr>
+              <w:t xml:space="preserve">เลือกสินค้าและตั้งจำนวนขั้นต่ำที่ต้องซื้อ</w:t>
+            </w:r>
+          </w:p>
+        </w:tc>
+      </w:tr>
+      <w:tr>
+        <w:tc>
+          <w:tcPr>
+            <w:tcW w:type="dxa" w:w="2298"/>
+            <w:tcMar>
+              <w:top w:type="dxa" w:w="60"/>
+              <w:left w:type="dxa" w:w="90"/>
+              <w:bottom w:type="dxa" w:w="60"/>
+              <w:right w:type="dxa" w:w="90"/>
+            </w:tcMar>
+          </w:tcPr>
+          <w:p>
+            <w:pPr>
+              <w:spacing w:after="0" w:before="0"/>
+            </w:pPr>
+            <w:r>
+              <w:rPr>
+                <w:rFonts w:ascii="TH SarabunPSK" w:cs="TH SarabunPSK" w:eastAsia="TH SarabunPSK" w:hAnsi="TH SarabunPSK"/>
+                <w:b w:val="false"/>
+                <w:bCs w:val="false"/>
+                <w:sz w:val="27"/>
+                <w:szCs w:val="27"/>
+              </w:rPr>
+              <w:t xml:space="preserve">สินค้าทางเลือก</w:t>
+            </w:r>
+          </w:p>
+        </w:tc>
+        <w:tc>
+          <w:tcPr>
+            <w:tcW w:type="dxa" w:w="6728"/>
+            <w:tcMar>
+              <w:top w:type="dxa" w:w="60"/>
+              <w:left w:type="dxa" w:w="90"/>
+              <w:bottom w:type="dxa" w:w="60"/>
+              <w:right w:type="dxa" w:w="90"/>
+            </w:tcMar>
+          </w:tcPr>
+          <w:p>
+            <w:pPr>
+              <w:spacing w:after="0" w:before="0"/>
+            </w:pPr>
+            <w:r>
+              <w:rPr>
+                <w:rFonts w:ascii="TH SarabunPSK" w:cs="TH SarabunPSK" w:eastAsia="TH SarabunPSK" w:hAnsi="TH SarabunPSK"/>
+                <w:b w:val="false"/>
+                <w:bCs w:val="false"/>
+                <w:sz w:val="27"/>
+                <w:szCs w:val="27"/>
+              </w:rPr>
+              <w:t xml:space="preserve">เลือกสินค้าและตั้งจำนวนเริ่มต้นที่แนะนำ</w:t>
+            </w:r>
+          </w:p>
+        </w:tc>
+      </w:tr>
+      <w:tr>
+        <w:tc>
+          <w:tcPr>
+            <w:tcW w:type="dxa" w:w="2298"/>
+            <w:tcMar>
+              <w:top w:type="dxa" w:w="60"/>
+              <w:left w:type="dxa" w:w="90"/>
+              <w:bottom w:type="dxa" w:w="60"/>
+              <w:right w:type="dxa" w:w="90"/>
+            </w:tcMar>
+          </w:tcPr>
+          <w:p>
+            <w:pPr>
+              <w:spacing w:after="0" w:before="0"/>
+            </w:pPr>
+            <w:r>
+              <w:rPr>
+                <w:rFonts w:ascii="TH SarabunPSK" w:cs="TH SarabunPSK" w:eastAsia="TH SarabunPSK" w:hAnsi="TH SarabunPSK"/>
+                <w:b w:val="false"/>
+                <w:bCs w:val="false"/>
+                <w:sz w:val="27"/>
+                <w:szCs w:val="27"/>
+              </w:rPr>
+              <w:t xml:space="preserve">ส่วนลดชุดเซต</w:t>
+            </w:r>
+          </w:p>
+        </w:tc>
+        <w:tc>
+          <w:tcPr>
+            <w:tcW w:type="dxa" w:w="6728"/>
+            <w:tcMar>
+              <w:top w:type="dxa" w:w="60"/>
+              <w:left w:type="dxa" w:w="90"/>
+              <w:bottom w:type="dxa" w:w="60"/>
+              <w:right w:type="dxa" w:w="90"/>
+            </w:tcMar>
+          </w:tcPr>
+          <w:p>
+            <w:pPr>
+              <w:spacing w:after="0" w:before="0"/>
+            </w:pPr>
+            <w:r>
+              <w:rPr>
+                <w:rFonts w:ascii="TH SarabunPSK" w:cs="TH SarabunPSK" w:eastAsia="TH SarabunPSK" w:hAnsi="TH SarabunPSK"/>
+                <w:b w:val="false"/>
+                <w:bCs w:val="false"/>
+                <w:sz w:val="27"/>
+                <w:szCs w:val="27"/>
+              </w:rPr>
+              <w:t xml:space="preserve">ตั้งส่วนลดรวมเมื่อซื้อทั้งเซต</w:t>
+            </w:r>
+          </w:p>
+        </w:tc>
+      </w:tr>
+    </w:tbl>
+    <w:p>
+      <w:pPr>
+        <w:spacing w:after="120"/>
+      </w:pPr>
     </w:p>
     <w:sectPr>
       <w:headerReference w:type="default" r:id="rId6"/>

</xml_diff>

<commit_message>
Add split-modules script to generate implementation-reference files from Pharmaplex-Platform-Spec.md
</commit_message>
<xml_diff>
--- a/spec/Pharmaplex-Platform-Spec.docx
+++ b/spec/Pharmaplex-Platform-Spec.docx
@@ -3369,7 +3369,7 @@
           <w:sz w:val="34"/>
           <w:szCs w:val="34"/>
         </w:rPr>
-        <w:t xml:space="preserve"> ลูกค้าเลือกตัวเลือกของสินค้า กรอกข้อมูลตามช่องที่แอดมินกำหนด อัปโหลดโลโก้หรือไฟล์ตัวอย่างงาน (AI, EPS, PDF, SVG ที่แนะนำ และ PNG โปร่งใส / JPG ความละเอียดสูง ไม่เกิน 20 MB) และต้องยอมรับเงื่อนไขของสินค้าก่อนดำเนินการต่อ ถ้าเลือกขนาดกำหนดเองในสินค้าที่คิดราคาต่อชิ้น หรือเลือกขนาดที่ยังไม่เคยตั้งราคาไว้ ระบบจะส่งคำสั่งซื้อไปให้เจ้าหน้าที่ตีราคาก่อน ลูกค้าสั่งซื้อได้เสมอไม่ว่ากรณีใด</w:t>
+        <w:t xml:space="preserve"> ลูกค้าเลือกตัวเลือกของสินค้า กรอกข้อมูลตามช่องที่แอดมินกำหนด อัปโหลดโลโก้หรือไฟล์ตัวอย่างงาน (AI, EPS, PDF, SVG ที่แนะนำ และ PNG โปร่งใส / JPG ความละเอียดสูง ไม่เกิน 20 MB) เปิดดูตัวอย่างไฟล์ที่เลือกได้ก่อนส่งจริง และต้องยอมรับเงื่อนไขของสินค้าก่อนดำเนินการต่อ ถ้าเลือกขนาดกำหนดเองในสินค้าที่คิดราคาต่อชิ้น หรือเลือกขนาดที่ยังไม่เคยตั้งราคาไว้ ระบบจะส่งคำสั่งซื้อไปให้เจ้าหน้าที่ตีราคาก่อน ลูกค้าสั่งซื้อได้เสมอไม่ว่ากรณีใด</w:t>
       </w:r>
     </w:p>
     <w:p>
@@ -3456,7 +3456,7 @@
           <w:sz w:val="34"/>
           <w:szCs w:val="34"/>
         </w:rPr>
-        <w:t xml:space="preserve"> ลูกค้าเลือกวิธีรับสินค้าและที่อยู่ในขั้นตอนเดียวกับการสรุปยอด (รายละเอียดอยู่ในหัวข้อ 2.9) ระบบคำนวณยอดมัดจำ 50% จาก (ค่าสินค้า + ค่าบล็อค − ส่วนลด) ยังไม่รวมค่าจัดส่ง ลูกค้าชำระด้วยการโอนพร้อมแนบสลิป (รอแอดมินตรวจ) หรือสแกน QR PromptPay (ระบบยืนยันให้อัตโนมัติ ไม่ต้องรอตรวจ) ถ้ามีใบลดหนี้ในบัญชีเลือกใช้ตัดยอดได้ทันที และถอนออกได้ก่อนส่งหลักฐานการชำระเงิน วิธีรับสินค้าและที่อยู่จะล็อกแก้ไขไม่ได้หลังชำระมัดจำ</w:t>
+        <w:t xml:space="preserve"> ลูกค้าเลือกวิธีรับสินค้าและที่อยู่ในขั้นตอนเดียวกับการสรุปยอด (รายละเอียดอยู่ในหัวข้อ 2.9) ระบบคำนวณยอดมัดจำ 50% จาก (ค่าสินค้า + ค่าบล็อค − ส่วนลด) ยังไม่รวมค่าจัดส่ง ลูกค้าชำระด้วยการโอนพร้อมแนบสลิป (รอแอดมินตรวจ) หรือสแกน QR PromptPay (ระบบยืนยันให้อัตโนมัติ ไม่ต้องรอตรวจ) ถ้ามีใบลดหนี้ในบัญชีเลือกใช้ตัดยอดได้ทันที และถอนออกได้ก่อนส่งหลักฐานการชำระเงิน ชำระสะสมหลายครั้งได้ ไม่ต้องจ่ายครบในครั้งเดียว หรือแจ้งเจ้าหน้าที่ให้บันทึกสลิปแทนได้ถ้าส่งหลักฐานมาทางช่องทางอื่น (รายละเอียดอยู่ในหัวข้อ 2.8) วิธีรับสินค้าและที่อยู่จะล็อกแก้ไขไม่ได้หลังชำระมัดจำ</w:t>
       </w:r>
     </w:p>
     <w:p>
@@ -3798,7 +3798,7 @@
           <w:sz w:val="34"/>
           <w:szCs w:val="34"/>
         </w:rPr>
-        <w:t xml:space="preserve"> ถ้ายังมียอดค้าง ลูกค้าชำระส่วนที่เหลือผ่านหน้าเว็บ และแอดมินตรวจสลิปรอบที่ 2 ถ้าไม่มียอดค้าง (ยอดพอดีหรือจ่ายเกิน) ข้ามการชำระรอบนี้ไปได้เลย และถ้าลูกค้าจ่ายเกินยอดจริง ระบบออกใบลดหนี้คืนให้โดยอัตโนมัติ</w:t>
+        <w:t xml:space="preserve"> ถ้ายังมียอดค้าง ลูกค้าชำระส่วนที่เหลือผ่านหน้าเว็บ (สะสมหลายครั้งได้เช่นเดียวกับมัดจำ) และแอดมินตรวจสลิปรอบที่ 2 ถ้าไม่มียอดค้าง (ยอดพอดีหรือจ่ายเกิน หรือใบลดหนี้ครอบคลุมพอดี) ข้ามการชำระรอบนี้ไปได้เลย และถ้าลูกค้าจ่ายเกินยอดจริง ระบบออกใบลดหนี้คืนให้โดยอัตโนมัติ</w:t>
       </w:r>
     </w:p>
     <w:p>
@@ -5824,6 +5824,52 @@
           <w:szCs w:val="34"/>
         </w:rPr>
         <w:t xml:space="preserve">ใบลดหนี้ใช้ตัดยอดได้ทั้งตอนชำระมัดจำและรอบที่ 2 เลือกใช้แล้วตัดยอดทันที ถอนออกได้ก่อนส่งหลักฐานการชำระเงิน</w:t>
+      </w:r>
+    </w:p>
+    <w:p>
+      <w:pPr>
+        <w:spacing w:after="80" w:line="400"/>
+        <w:ind w:left="360" w:hanging="300"/>
+        <w:jc w:val="both"/>
+      </w:pPr>
+      <w:r>
+        <w:rPr>
+          <w:rFonts w:ascii="TH SarabunPSK" w:cs="TH SarabunPSK" w:eastAsia="TH SarabunPSK" w:hAnsi="TH SarabunPSK"/>
+          <w:sz w:val="34"/>
+          <w:szCs w:val="34"/>
+        </w:rPr>
+        <w:t xml:space="preserve">•  </w:t>
+      </w:r>
+      <w:r>
+        <w:rPr>
+          <w:rFonts w:ascii="TH SarabunPSK" w:cs="TH SarabunPSK" w:eastAsia="TH SarabunPSK" w:hAnsi="TH SarabunPSK"/>
+          <w:sz w:val="34"/>
+          <w:szCs w:val="34"/>
+        </w:rPr>
+        <w:t xml:space="preserve">ชำระได้หลายงวดสะสม ทั้งมัดจำและรอบที่ 2 แต่ละครั้งที่แนบสลิประบบจะเก็บไว้ก่อน ยังไม่ส่งให้แอดมินตรวจจนกว่ายอดสลิปรวมจะครบยอดที่ต้องชำระ (หลังหักใบลดหนี้) ยอดรวมเกินยอดที่ต้องชำระจะบันทึกไม่ได้ ถ้าใบลดหนี้ครอบคลุมยอดพอดี ไม่ต้องแนบสลิปเพิ่ม</w:t>
+      </w:r>
+    </w:p>
+    <w:p>
+      <w:pPr>
+        <w:spacing w:after="80" w:line="400"/>
+        <w:ind w:left="360" w:hanging="300"/>
+        <w:jc w:val="both"/>
+      </w:pPr>
+      <w:r>
+        <w:rPr>
+          <w:rFonts w:ascii="TH SarabunPSK" w:cs="TH SarabunPSK" w:eastAsia="TH SarabunPSK" w:hAnsi="TH SarabunPSK"/>
+          <w:sz w:val="34"/>
+          <w:szCs w:val="34"/>
+        </w:rPr>
+        <w:t xml:space="preserve">•  </w:t>
+      </w:r>
+      <w:r>
+        <w:rPr>
+          <w:rFonts w:ascii="TH SarabunPSK" w:cs="TH SarabunPSK" w:eastAsia="TH SarabunPSK" w:hAnsi="TH SarabunPSK"/>
+          <w:sz w:val="34"/>
+          <w:szCs w:val="34"/>
+        </w:rPr>
+        <w:t xml:space="preserve">เจ้าหน้าที่บันทึกการชำระแทนลูกค้าได้ เช่น กรณีลูกค้าส่งสลิปมาทางโทรศัพท์หรือ LINE โดยรับเฉพาะสลิปโอนเงิน ไม่รองรับ QR PromptPay ในกรณีนี้</w:t>
       </w:r>
     </w:p>
     <w:p>

</xml_diff>

<commit_message>
Enhance Pharmaplex Platform Specification: Update user roles, module interactions, and promotional details
- Expanded admin role to include order placement on behalf of customers in specific cases.
- Added collaborative module functionality allowing admin to configure module interactions within a single bill.
- Clarified policies on product returns, customer notifications, and VAT inclusivity.
- Introduced new promotional rules including cumulative point multipliers and maximum discount ceilings.
- Specified conditions for paper coupons and online coupon usage, including restrictions on web usage for paper coupons.
- Updated annual accumulation campaign details to reset yearly and clarified point expiration policies.
- Enhanced clarity on the starter set for new pharmacies, specifying B2B exclusivity and ordering processes.
</commit_message>
<xml_diff>
--- a/spec/Pharmaplex-Platform-Spec.docx
+++ b/spec/Pharmaplex-Platform-Spec.docx
@@ -1337,7 +1337,7 @@
                 <w:sz w:val="27"/>
                 <w:szCs w:val="27"/>
               </w:rPr>
-              <w:t xml:space="preserve">แอดมิน</w:t>
+              <w:t xml:space="preserve">แอดมิน (รวมเซลล์)</w:t>
             </w:r>
           </w:p>
         </w:tc>
@@ -1363,7 +1363,7 @@
                 <w:sz w:val="27"/>
                 <w:szCs w:val="27"/>
               </w:rPr>
-              <w:t xml:space="preserve">ตั้งค่าสินค้า โปรโมชั่น คูปอง แคมเปญ ตรวจสลิป อนุมัติคำสั่งซื้อ ปรับจำนวนจริง เปิดบิล</w:t>
+              <w:t xml:space="preserve">ตั้งค่าสินค้า โปรโมชั่น คูปอง แคมเปญ ตรวจสลิป อนุมัติคำสั่งซื้อ ปรับจำนวนจริง เปิดบิล และสั่งซื้อแทนลูกค้าได้ในบางกรณี เช่น เซลล์สั่งเซตร้านยาเปิดใหม่แทนลูกค้า</w:t>
             </w:r>
           </w:p>
         </w:tc>
@@ -1684,6 +1684,189 @@
           <w:szCs w:val="34"/>
         </w:rPr>
         <w:t xml:space="preserve"> ทุกการใช้คูปอง สิทธิ์ลุ้น และการแลกพอยท์มีประวัติให้ตรวจ</w:t>
+      </w:r>
+    </w:p>
+    <w:p>
+      <w:pPr>
+        <w:pStyle w:val="Heading3"/>
+        <w:keepNext/>
+        <w:spacing w:after="120" w:before="240"/>
+      </w:pPr>
+      <w:r>
+        <w:rPr>
+          <w:rFonts w:ascii="TH SarabunPSK" w:cs="TH SarabunPSK" w:eastAsia="TH SarabunPSK" w:hAnsi="TH SarabunPSK"/>
+          <w:b/>
+          <w:bCs/>
+          <w:color w:val="A32F34"/>
+          <w:sz w:val="32"/>
+          <w:szCs w:val="32"/>
+        </w:rPr>
+        <w:t xml:space="preserve">1.6 การทำงานร่วมกันระหว่างโมดูลและนโยบายร่วมของระบบ</w:t>
+      </w:r>
+    </w:p>
+    <w:p>
+      <w:pPr>
+        <w:spacing w:after="80" w:line="400"/>
+        <w:ind w:left="360" w:hanging="300"/>
+        <w:jc w:val="both"/>
+      </w:pPr>
+      <w:r>
+        <w:rPr>
+          <w:rFonts w:ascii="TH SarabunPSK" w:cs="TH SarabunPSK" w:eastAsia="TH SarabunPSK" w:hAnsi="TH SarabunPSK"/>
+          <w:sz w:val="34"/>
+          <w:szCs w:val="34"/>
+        </w:rPr>
+        <w:t xml:space="preserve">•  </w:t>
+      </w:r>
+      <w:r>
+        <w:rPr>
+          <w:rFonts w:ascii="TH SarabunPSK" w:cs="TH SarabunPSK" w:eastAsia="TH SarabunPSK" w:hAnsi="TH SarabunPSK"/>
+          <w:b/>
+          <w:bCs/>
+          <w:sz w:val="34"/>
+          <w:szCs w:val="34"/>
+        </w:rPr>
+        <w:t xml:space="preserve">การใช้ร่วมกันในบิลเดียว</w:t>
+      </w:r>
+      <w:r>
+        <w:rPr>
+          <w:rFonts w:ascii="TH SarabunPSK" w:cs="TH SarabunPSK" w:eastAsia="TH SarabunPSK" w:hAnsi="TH SarabunPSK"/>
+          <w:sz w:val="34"/>
+          <w:szCs w:val="34"/>
+        </w:rPr>
+        <w:t xml:space="preserve"> แอดมินตั้งค่าได้เองว่าแต่ละโมดูล (โปรโมชั่น คูปอง พอยท์ แคมเปญ สิทธิ์ลุ้น) เปิดหรือปิดใช้งาน และกำหนดได้ว่าโมดูลไหนใช้ร่วมกับโมดูลไหนได้บ้างในตะกร้าเดียวกัน ไม่ได้กำหนดตายตัวไว้ในระบบ</w:t>
+      </w:r>
+    </w:p>
+    <w:p>
+      <w:pPr>
+        <w:spacing w:after="80" w:line="400"/>
+        <w:ind w:left="360" w:hanging="300"/>
+        <w:jc w:val="both"/>
+      </w:pPr>
+      <w:r>
+        <w:rPr>
+          <w:rFonts w:ascii="TH SarabunPSK" w:cs="TH SarabunPSK" w:eastAsia="TH SarabunPSK" w:hAnsi="TH SarabunPSK"/>
+          <w:sz w:val="34"/>
+          <w:szCs w:val="34"/>
+        </w:rPr>
+        <w:t xml:space="preserve">•  </w:t>
+      </w:r>
+      <w:r>
+        <w:rPr>
+          <w:rFonts w:ascii="TH SarabunPSK" w:cs="TH SarabunPSK" w:eastAsia="TH SarabunPSK" w:hAnsi="TH SarabunPSK"/>
+          <w:b/>
+          <w:bCs/>
+          <w:sz w:val="34"/>
+          <w:szCs w:val="34"/>
+        </w:rPr>
+        <w:t xml:space="preserve">ยกเลิก / คืนสินค้า</w:t>
+      </w:r>
+      <w:r>
+        <w:rPr>
+          <w:rFonts w:ascii="TH SarabunPSK" w:cs="TH SarabunPSK" w:eastAsia="TH SarabunPSK" w:hAnsi="TH SarabunPSK"/>
+          <w:sz w:val="34"/>
+          <w:szCs w:val="34"/>
+        </w:rPr>
+        <w:t xml:space="preserve"> เมื่อคูปอง พอยท์ หรือของแถมถูกใช้ไปแล้ว การยกเลิกหรือคืนสินค้าภายหลังจะไม่เรียกคืนสิ่งที่ใช้ไปแล้ว ถือว่าใช้สิทธิ์ไปแล้ว (คำขอคืนสินค้าทุกกรณีต้องผ่านการอนุมัติจากแอดมินก่อนอยู่แล้ว)</w:t>
+      </w:r>
+    </w:p>
+    <w:p>
+      <w:pPr>
+        <w:spacing w:after="80" w:line="400"/>
+        <w:ind w:left="360" w:hanging="300"/>
+        <w:jc w:val="both"/>
+      </w:pPr>
+      <w:r>
+        <w:rPr>
+          <w:rFonts w:ascii="TH SarabunPSK" w:cs="TH SarabunPSK" w:eastAsia="TH SarabunPSK" w:hAnsi="TH SarabunPSK"/>
+          <w:sz w:val="34"/>
+          <w:szCs w:val="34"/>
+        </w:rPr>
+        <w:t xml:space="preserve">•  </w:t>
+      </w:r>
+      <w:r>
+        <w:rPr>
+          <w:rFonts w:ascii="TH SarabunPSK" w:cs="TH SarabunPSK" w:eastAsia="TH SarabunPSK" w:hAnsi="TH SarabunPSK"/>
+          <w:b/>
+          <w:bCs/>
+          <w:sz w:val="34"/>
+          <w:szCs w:val="34"/>
+        </w:rPr>
+        <w:t xml:space="preserve">การแจ้งเตือนลูกค้า</w:t>
+      </w:r>
+      <w:r>
+        <w:rPr>
+          <w:rFonts w:ascii="TH SarabunPSK" w:cs="TH SarabunPSK" w:eastAsia="TH SarabunPSK" w:hAnsi="TH SarabunPSK"/>
+          <w:sz w:val="34"/>
+          <w:szCs w:val="34"/>
+        </w:rPr>
+        <w:t xml:space="preserve"> ทั้งระบบไม่มีการแจ้งเตือนผ่านอีเมล SMS หรือ LINE ลูกค้าต้องเข้าเว็บเพื่อติดตามสถานะและสิทธิ์ต่าง ๆ ด้วยตนเอง</w:t>
+      </w:r>
+    </w:p>
+    <w:p>
+      <w:pPr>
+        <w:spacing w:after="80" w:line="400"/>
+        <w:ind w:left="360" w:hanging="300"/>
+        <w:jc w:val="both"/>
+      </w:pPr>
+      <w:r>
+        <w:rPr>
+          <w:rFonts w:ascii="TH SarabunPSK" w:cs="TH SarabunPSK" w:eastAsia="TH SarabunPSK" w:hAnsi="TH SarabunPSK"/>
+          <w:sz w:val="34"/>
+          <w:szCs w:val="34"/>
+        </w:rPr>
+        <w:t xml:space="preserve">•  </w:t>
+      </w:r>
+      <w:r>
+        <w:rPr>
+          <w:rFonts w:ascii="TH SarabunPSK" w:cs="TH SarabunPSK" w:eastAsia="TH SarabunPSK" w:hAnsi="TH SarabunPSK"/>
+          <w:b/>
+          <w:bCs/>
+          <w:sz w:val="34"/>
+          <w:szCs w:val="34"/>
+        </w:rPr>
+        <w:t xml:space="preserve">ภาษีมูลค่าเพิ่ม (VAT)</w:t>
+      </w:r>
+      <w:r>
+        <w:rPr>
+          <w:rFonts w:ascii="TH SarabunPSK" w:cs="TH SarabunPSK" w:eastAsia="TH SarabunPSK" w:hAnsi="TH SarabunPSK"/>
+          <w:sz w:val="34"/>
+          <w:szCs w:val="34"/>
+        </w:rPr>
+        <w:t xml:space="preserve"> ราคาสินค้า ค่าจัดส่ง และส่วนลดที่แสดงในเอกสารนี้ทั้งหมดเป็นราคารวม VAT แล้ว</w:t>
+      </w:r>
+    </w:p>
+    <w:p>
+      <w:pPr>
+        <w:spacing w:after="80" w:line="400"/>
+        <w:ind w:left="360" w:hanging="300"/>
+        <w:jc w:val="both"/>
+      </w:pPr>
+      <w:r>
+        <w:rPr>
+          <w:rFonts w:ascii="TH SarabunPSK" w:cs="TH SarabunPSK" w:eastAsia="TH SarabunPSK" w:hAnsi="TH SarabunPSK"/>
+          <w:sz w:val="34"/>
+          <w:szCs w:val="34"/>
+        </w:rPr>
+        <w:t xml:space="preserve">•  </w:t>
+      </w:r>
+      <w:r>
+        <w:rPr>
+          <w:rFonts w:ascii="TH SarabunPSK" w:cs="TH SarabunPSK" w:eastAsia="TH SarabunPSK" w:hAnsi="TH SarabunPSK"/>
+          <w:b/>
+          <w:bCs/>
+          <w:sz w:val="34"/>
+          <w:szCs w:val="34"/>
+        </w:rPr>
+        <w:t xml:space="preserve">B2B กับ B2C</w:t>
+      </w:r>
+      <w:r>
+        <w:rPr>
+          <w:rFonts w:ascii="TH SarabunPSK" w:cs="TH SarabunPSK" w:eastAsia="TH SarabunPSK" w:hAnsi="TH SarabunPSK"/>
+          <w:sz w:val="34"/>
+          <w:szCs w:val="34"/>
+        </w:rPr>
+        <w:t xml:space="preserve"> ทุกโมดูลใช้กติกาเดียวกันกับลูกค้าทุกกลุ่ม ยกเว้นเซตร้านยาเปิดใหม่ (โมดูล 7) ที่เปิดขายเฉพาะลูกค้าประเภทร้านค้า (B2B) เท่านั้น</w:t>
       </w:r>
     </w:p>
     <w:p>
@@ -7760,8 +7943,8 @@
         </w:tblBorders>
       </w:tblPr>
       <w:tblGrid>
-        <w:gridCol w:w="2655"/>
-        <w:gridCol w:w="6371"/>
+        <w:gridCol w:w="3500"/>
+        <w:gridCol w:w="5526"/>
       </w:tblGrid>
       <w:tr>
         <w:trPr>
@@ -7769,7 +7952,7 @@
         </w:trPr>
         <w:tc>
           <w:tcPr>
-            <w:tcW w:type="dxa" w:w="2655"/>
+            <w:tcW w:type="dxa" w:w="3500"/>
             <w:shd w:fill="A32F34" w:color="auto" w:val="clear"/>
             <w:tcMar>
               <w:top w:type="dxa" w:w="60"/>
@@ -7797,7 +7980,7 @@
         </w:tc>
         <w:tc>
           <w:tcPr>
-            <w:tcW w:type="dxa" w:w="6371"/>
+            <w:tcW w:type="dxa" w:w="5526"/>
             <w:shd w:fill="A32F34" w:color="auto" w:val="clear"/>
             <w:tcMar>
               <w:top w:type="dxa" w:w="60"/>
@@ -7827,7 +8010,7 @@
       <w:tr>
         <w:tc>
           <w:tcPr>
-            <w:tcW w:type="dxa" w:w="2655"/>
+            <w:tcW w:type="dxa" w:w="3500"/>
             <w:tcMar>
               <w:top w:type="dxa" w:w="60"/>
               <w:left w:type="dxa" w:w="90"/>
@@ -7853,7 +8036,7 @@
         </w:tc>
         <w:tc>
           <w:tcPr>
-            <w:tcW w:type="dxa" w:w="6371"/>
+            <w:tcW w:type="dxa" w:w="5526"/>
             <w:tcMar>
               <w:top w:type="dxa" w:w="60"/>
               <w:left w:type="dxa" w:w="90"/>
@@ -7881,7 +8064,7 @@
       <w:tr>
         <w:tc>
           <w:tcPr>
-            <w:tcW w:type="dxa" w:w="2655"/>
+            <w:tcW w:type="dxa" w:w="3500"/>
             <w:tcMar>
               <w:top w:type="dxa" w:w="60"/>
               <w:left w:type="dxa" w:w="90"/>
@@ -7907,7 +8090,7 @@
         </w:tc>
         <w:tc>
           <w:tcPr>
-            <w:tcW w:type="dxa" w:w="6371"/>
+            <w:tcW w:type="dxa" w:w="5526"/>
             <w:tcMar>
               <w:top w:type="dxa" w:w="60"/>
               <w:left w:type="dxa" w:w="90"/>
@@ -7935,7 +8118,7 @@
       <w:tr>
         <w:tc>
           <w:tcPr>
-            <w:tcW w:type="dxa" w:w="2655"/>
+            <w:tcW w:type="dxa" w:w="3500"/>
             <w:tcMar>
               <w:top w:type="dxa" w:w="60"/>
               <w:left w:type="dxa" w:w="90"/>
@@ -7961,7 +8144,7 @@
         </w:tc>
         <w:tc>
           <w:tcPr>
-            <w:tcW w:type="dxa" w:w="6371"/>
+            <w:tcW w:type="dxa" w:w="5526"/>
             <w:tcMar>
               <w:top w:type="dxa" w:w="60"/>
               <w:left w:type="dxa" w:w="90"/>
@@ -7989,7 +8172,7 @@
       <w:tr>
         <w:tc>
           <w:tcPr>
-            <w:tcW w:type="dxa" w:w="2655"/>
+            <w:tcW w:type="dxa" w:w="3500"/>
             <w:tcMar>
               <w:top w:type="dxa" w:w="60"/>
               <w:left w:type="dxa" w:w="90"/>
@@ -8015,7 +8198,7 @@
         </w:tc>
         <w:tc>
           <w:tcPr>
-            <w:tcW w:type="dxa" w:w="6371"/>
+            <w:tcW w:type="dxa" w:w="5526"/>
             <w:tcMar>
               <w:top w:type="dxa" w:w="60"/>
               <w:left w:type="dxa" w:w="90"/>
@@ -8043,7 +8226,7 @@
       <w:tr>
         <w:tc>
           <w:tcPr>
-            <w:tcW w:type="dxa" w:w="2655"/>
+            <w:tcW w:type="dxa" w:w="3500"/>
             <w:tcMar>
               <w:top w:type="dxa" w:w="60"/>
               <w:left w:type="dxa" w:w="90"/>
@@ -8069,7 +8252,7 @@
         </w:tc>
         <w:tc>
           <w:tcPr>
-            <w:tcW w:type="dxa" w:w="6371"/>
+            <w:tcW w:type="dxa" w:w="5526"/>
             <w:tcMar>
               <w:top w:type="dxa" w:w="60"/>
               <w:left w:type="dxa" w:w="90"/>
@@ -8090,6 +8273,60 @@
                 <w:szCs w:val="27"/>
               </w:rPr>
               <w:t xml:space="preserve">กำหนดวันเริ่มต้นและสิ้นสุด</w:t>
+            </w:r>
+          </w:p>
+        </w:tc>
+      </w:tr>
+      <w:tr>
+        <w:tc>
+          <w:tcPr>
+            <w:tcW w:type="dxa" w:w="3500"/>
+            <w:tcMar>
+              <w:top w:type="dxa" w:w="60"/>
+              <w:left w:type="dxa" w:w="90"/>
+              <w:bottom w:type="dxa" w:w="60"/>
+              <w:right w:type="dxa" w:w="90"/>
+            </w:tcMar>
+          </w:tcPr>
+          <w:p>
+            <w:pPr>
+              <w:spacing w:after="0" w:before="0"/>
+            </w:pPr>
+            <w:r>
+              <w:rPr>
+                <w:rFonts w:ascii="TH SarabunPSK" w:cs="TH SarabunPSK" w:eastAsia="TH SarabunPSK" w:hAnsi="TH SarabunPSK"/>
+                <w:b w:val="false"/>
+                <w:bCs w:val="false"/>
+                <w:sz w:val="27"/>
+                <w:szCs w:val="27"/>
+              </w:rPr>
+              <w:t xml:space="preserve">การทวีคูณเมื่อซื้อเกินเงื่อนไขหลายเท่า</w:t>
+            </w:r>
+          </w:p>
+        </w:tc>
+        <w:tc>
+          <w:tcPr>
+            <w:tcW w:type="dxa" w:w="5526"/>
+            <w:tcMar>
+              <w:top w:type="dxa" w:w="60"/>
+              <w:left w:type="dxa" w:w="90"/>
+              <w:bottom w:type="dxa" w:w="60"/>
+              <w:right w:type="dxa" w:w="90"/>
+            </w:tcMar>
+          </w:tcPr>
+          <w:p>
+            <w:pPr>
+              <w:spacing w:after="0" w:before="0"/>
+            </w:pPr>
+            <w:r>
+              <w:rPr>
+                <w:rFonts w:ascii="TH SarabunPSK" w:cs="TH SarabunPSK" w:eastAsia="TH SarabunPSK" w:hAnsi="TH SarabunPSK"/>
+                <w:b w:val="false"/>
+                <w:bCs w:val="false"/>
+                <w:sz w:val="27"/>
+                <w:szCs w:val="27"/>
+              </w:rPr>
+              <w:t xml:space="preserve">เช่น ลูกค้าซื้อ 2 เท่าหรือ 3 เท่าของจำนวนที่กำหนดในบิลเดียว แอดมินเลือกได้ต่อโปรโมชั่นว่าจะให้ผลตอบแทนทวีคูณตามจำนวน หรือจำกัดไว้ 1 ครั้งต่อบิล</w:t>
             </w:r>
           </w:p>
         </w:tc>
@@ -8127,8 +8364,8 @@
         </w:tblBorders>
       </w:tblPr>
       <w:tblGrid>
-        <w:gridCol w:w="1617"/>
-        <w:gridCol w:w="7409"/>
+        <w:gridCol w:w="1504"/>
+        <w:gridCol w:w="7522"/>
       </w:tblGrid>
       <w:tr>
         <w:trPr>
@@ -8136,7 +8373,7 @@
         </w:trPr>
         <w:tc>
           <w:tcPr>
-            <w:tcW w:type="dxa" w:w="1617"/>
+            <w:tcW w:type="dxa" w:w="1504"/>
             <w:shd w:fill="A32F34" w:color="auto" w:val="clear"/>
             <w:tcMar>
               <w:top w:type="dxa" w:w="60"/>
@@ -8164,7 +8401,7 @@
         </w:tc>
         <w:tc>
           <w:tcPr>
-            <w:tcW w:type="dxa" w:w="7409"/>
+            <w:tcW w:type="dxa" w:w="7522"/>
             <w:shd w:fill="A32F34" w:color="auto" w:val="clear"/>
             <w:tcMar>
               <w:top w:type="dxa" w:w="60"/>
@@ -8194,7 +8431,7 @@
       <w:tr>
         <w:tc>
           <w:tcPr>
-            <w:tcW w:type="dxa" w:w="1617"/>
+            <w:tcW w:type="dxa" w:w="1504"/>
             <w:tcMar>
               <w:top w:type="dxa" w:w="60"/>
               <w:left w:type="dxa" w:w="90"/>
@@ -8220,27 +8457,27 @@
         </w:tc>
         <w:tc>
           <w:tcPr>
-            <w:tcW w:type="dxa" w:w="7409"/>
-            <w:tcMar>
-              <w:top w:type="dxa" w:w="60"/>
-              <w:left w:type="dxa" w:w="90"/>
-              <w:bottom w:type="dxa" w:w="60"/>
-              <w:right w:type="dxa" w:w="90"/>
-            </w:tcMar>
-          </w:tcPr>
-          <w:p>
-            <w:pPr>
-              <w:spacing w:after="0" w:before="0"/>
-            </w:pPr>
-            <w:r>
-              <w:rPr>
-                <w:rFonts w:ascii="TH SarabunPSK" w:cs="TH SarabunPSK" w:eastAsia="TH SarabunPSK" w:hAnsi="TH SarabunPSK"/>
-                <w:b w:val="false"/>
-                <w:bCs w:val="false"/>
-                <w:sz w:val="27"/>
-                <w:szCs w:val="27"/>
-              </w:rPr>
-              <w:t xml:space="preserve">ซื้อนมผงสูตร 3 คู่กับขวดนม PP รับของแถมตามจำนวนที่กำหนด</w:t>
+            <w:tcW w:type="dxa" w:w="7522"/>
+            <w:tcMar>
+              <w:top w:type="dxa" w:w="60"/>
+              <w:left w:type="dxa" w:w="90"/>
+              <w:bottom w:type="dxa" w:w="60"/>
+              <w:right w:type="dxa" w:w="90"/>
+            </w:tcMar>
+          </w:tcPr>
+          <w:p>
+            <w:pPr>
+              <w:spacing w:after="0" w:before="0"/>
+            </w:pPr>
+            <w:r>
+              <w:rPr>
+                <w:rFonts w:ascii="TH SarabunPSK" w:cs="TH SarabunPSK" w:eastAsia="TH SarabunPSK" w:hAnsi="TH SarabunPSK"/>
+                <w:b w:val="false"/>
+                <w:bCs w:val="false"/>
+                <w:sz w:val="27"/>
+                <w:szCs w:val="27"/>
+              </w:rPr>
+              <w:t xml:space="preserve">ซื้อนมผงสูตร 3 คู่กับขวดนม PP รับของแถมตามจำนวนที่กำหนด ถ้าของแถมหมดสต็อกระหว่างโปรโมชั่น active ระบบจะแจ้งเตือนแอดมินและปิดโปรโมชั่นนั้นชั่วคราวให้อัตโนมัติ</w:t>
             </w:r>
           </w:p>
         </w:tc>
@@ -8248,7 +8485,7 @@
       <w:tr>
         <w:tc>
           <w:tcPr>
-            <w:tcW w:type="dxa" w:w="1617"/>
+            <w:tcW w:type="dxa" w:w="1504"/>
             <w:tcMar>
               <w:top w:type="dxa" w:w="60"/>
               <w:left w:type="dxa" w:w="90"/>
@@ -8274,27 +8511,27 @@
         </w:tc>
         <w:tc>
           <w:tcPr>
-            <w:tcW w:type="dxa" w:w="7409"/>
-            <w:tcMar>
-              <w:top w:type="dxa" w:w="60"/>
-              <w:left w:type="dxa" w:w="90"/>
-              <w:bottom w:type="dxa" w:w="60"/>
-              <w:right w:type="dxa" w:w="90"/>
-            </w:tcMar>
-          </w:tcPr>
-          <w:p>
-            <w:pPr>
-              <w:spacing w:after="0" w:before="0"/>
-            </w:pPr>
-            <w:r>
-              <w:rPr>
-                <w:rFonts w:ascii="TH SarabunPSK" w:cs="TH SarabunPSK" w:eastAsia="TH SarabunPSK" w:hAnsi="TH SarabunPSK"/>
-                <w:b w:val="false"/>
-                <w:bCs w:val="false"/>
-                <w:sz w:val="27"/>
-                <w:szCs w:val="27"/>
-              </w:rPr>
-              <w:t xml:space="preserve">ซื้อสินค้าแบรนด์ที่กำหนดครบ 1,000 บาท ลดทันที 100 บาท</w:t>
+            <w:tcW w:type="dxa" w:w="7522"/>
+            <w:tcMar>
+              <w:top w:type="dxa" w:w="60"/>
+              <w:left w:type="dxa" w:w="90"/>
+              <w:bottom w:type="dxa" w:w="60"/>
+              <w:right w:type="dxa" w:w="90"/>
+            </w:tcMar>
+          </w:tcPr>
+          <w:p>
+            <w:pPr>
+              <w:spacing w:after="0" w:before="0"/>
+            </w:pPr>
+            <w:r>
+              <w:rPr>
+                <w:rFonts w:ascii="TH SarabunPSK" w:cs="TH SarabunPSK" w:eastAsia="TH SarabunPSK" w:hAnsi="TH SarabunPSK"/>
+                <w:b w:val="false"/>
+                <w:bCs w:val="false"/>
+                <w:sz w:val="27"/>
+                <w:szCs w:val="27"/>
+              </w:rPr>
+              <w:t xml:space="preserve">ซื้อสินค้าแบรนด์ที่กำหนดครบ 1,000 บาท ลดทันที 100 บาท ถ้าตั้งเป็นส่วนลด % ตั้งเพดานส่วนลดสูงสุดได้ เช่น ลด 15% สูงสุดไม่เกิน 100 บาท</w:t>
             </w:r>
           </w:p>
         </w:tc>
@@ -8302,7 +8539,7 @@
       <w:tr>
         <w:tc>
           <w:tcPr>
-            <w:tcW w:type="dxa" w:w="1617"/>
+            <w:tcW w:type="dxa" w:w="1504"/>
             <w:tcMar>
               <w:top w:type="dxa" w:w="60"/>
               <w:left w:type="dxa" w:w="90"/>
@@ -8328,7 +8565,7 @@
         </w:tc>
         <w:tc>
           <w:tcPr>
-            <w:tcW w:type="dxa" w:w="7409"/>
+            <w:tcW w:type="dxa" w:w="7522"/>
             <w:tcMar>
               <w:top w:type="dxa" w:w="60"/>
               <w:left w:type="dxa" w:w="90"/>
@@ -9159,10 +9396,10 @@
         </w:tblBorders>
       </w:tblPr>
       <w:tblGrid>
-        <w:gridCol w:w="1610"/>
-        <w:gridCol w:w="2645"/>
-        <w:gridCol w:w="2357"/>
-        <w:gridCol w:w="2414"/>
+        <w:gridCol w:w="1436"/>
+        <w:gridCol w:w="2359"/>
+        <w:gridCol w:w="3077"/>
+        <w:gridCol w:w="2154"/>
       </w:tblGrid>
       <w:tr>
         <w:trPr>
@@ -9170,7 +9407,7 @@
         </w:trPr>
         <w:tc>
           <w:tcPr>
-            <w:tcW w:type="dxa" w:w="1610"/>
+            <w:tcW w:type="dxa" w:w="1436"/>
             <w:shd w:fill="A32F34" w:color="auto" w:val="clear"/>
             <w:tcMar>
               <w:top w:type="dxa" w:w="60"/>
@@ -9198,7 +9435,7 @@
         </w:tc>
         <w:tc>
           <w:tcPr>
-            <w:tcW w:type="dxa" w:w="2645"/>
+            <w:tcW w:type="dxa" w:w="2359"/>
             <w:shd w:fill="A32F34" w:color="auto" w:val="clear"/>
             <w:tcMar>
               <w:top w:type="dxa" w:w="60"/>
@@ -9226,7 +9463,7 @@
         </w:tc>
         <w:tc>
           <w:tcPr>
-            <w:tcW w:type="dxa" w:w="2357"/>
+            <w:tcW w:type="dxa" w:w="3077"/>
             <w:shd w:fill="A32F34" w:color="auto" w:val="clear"/>
             <w:tcMar>
               <w:top w:type="dxa" w:w="60"/>
@@ -9254,7 +9491,7 @@
         </w:tc>
         <w:tc>
           <w:tcPr>
-            <w:tcW w:type="dxa" w:w="2414"/>
+            <w:tcW w:type="dxa" w:w="2154"/>
             <w:shd w:fill="A32F34" w:color="auto" w:val="clear"/>
             <w:tcMar>
               <w:top w:type="dxa" w:w="60"/>
@@ -9284,7 +9521,7 @@
       <w:tr>
         <w:tc>
           <w:tcPr>
-            <w:tcW w:type="dxa" w:w="1610"/>
+            <w:tcW w:type="dxa" w:w="1436"/>
             <w:tcMar>
               <w:top w:type="dxa" w:w="60"/>
               <w:left w:type="dxa" w:w="90"/>
@@ -9310,7 +9547,7 @@
         </w:tc>
         <w:tc>
           <w:tcPr>
-            <w:tcW w:type="dxa" w:w="2645"/>
+            <w:tcW w:type="dxa" w:w="2359"/>
             <w:tcMar>
               <w:top w:type="dxa" w:w="60"/>
               <w:left w:type="dxa" w:w="90"/>
@@ -9336,33 +9573,33 @@
         </w:tc>
         <w:tc>
           <w:tcPr>
-            <w:tcW w:type="dxa" w:w="2357"/>
-            <w:tcMar>
-              <w:top w:type="dxa" w:w="60"/>
-              <w:left w:type="dxa" w:w="90"/>
-              <w:bottom w:type="dxa" w:w="60"/>
-              <w:right w:type="dxa" w:w="90"/>
-            </w:tcMar>
-          </w:tcPr>
-          <w:p>
-            <w:pPr>
-              <w:spacing w:after="0" w:before="0"/>
-            </w:pPr>
-            <w:r>
-              <w:rPr>
-                <w:rFonts w:ascii="TH SarabunPSK" w:cs="TH SarabunPSK" w:eastAsia="TH SarabunPSK" w:hAnsi="TH SarabunPSK"/>
-                <w:b w:val="false"/>
-                <w:bCs w:val="false"/>
-                <w:sz w:val="27"/>
-                <w:szCs w:val="27"/>
-              </w:rPr>
-              <w:t xml:space="preserve">ตัวกระดาษที่ร้านฉีกเก็บไว้เป็นหลักฐาน</w:t>
-            </w:r>
-          </w:p>
-        </w:tc>
-        <w:tc>
-          <w:tcPr>
-            <w:tcW w:type="dxa" w:w="2414"/>
+            <w:tcW w:type="dxa" w:w="3077"/>
+            <w:tcMar>
+              <w:top w:type="dxa" w:w="60"/>
+              <w:left w:type="dxa" w:w="90"/>
+              <w:bottom w:type="dxa" w:w="60"/>
+              <w:right w:type="dxa" w:w="90"/>
+            </w:tcMar>
+          </w:tcPr>
+          <w:p>
+            <w:pPr>
+              <w:spacing w:after="0" w:before="0"/>
+            </w:pPr>
+            <w:r>
+              <w:rPr>
+                <w:rFonts w:ascii="TH SarabunPSK" w:cs="TH SarabunPSK" w:eastAsia="TH SarabunPSK" w:hAnsi="TH SarabunPSK"/>
+                <w:b w:val="false"/>
+                <w:bCs w:val="false"/>
+                <w:sz w:val="27"/>
+                <w:szCs w:val="27"/>
+              </w:rPr>
+              <w:t xml:space="preserve">ตัวกระดาษที่ร้านฉีกเก็บไว้เป็นหลักฐาน ใช้ได้เฉพาะหน้าร้าน/POS เท่านั้น ไม่รองรับการกรอกใช้งานบนเว็บ</w:t>
+            </w:r>
+          </w:p>
+        </w:tc>
+        <w:tc>
+          <w:tcPr>
+            <w:tcW w:type="dxa" w:w="2154"/>
             <w:tcMar>
               <w:top w:type="dxa" w:w="60"/>
               <w:left w:type="dxa" w:w="90"/>
@@ -9390,7 +9627,7 @@
       <w:tr>
         <w:tc>
           <w:tcPr>
-            <w:tcW w:type="dxa" w:w="1610"/>
+            <w:tcW w:type="dxa" w:w="1436"/>
             <w:tcMar>
               <w:top w:type="dxa" w:w="60"/>
               <w:left w:type="dxa" w:w="90"/>
@@ -9416,7 +9653,7 @@
         </w:tc>
         <w:tc>
           <w:tcPr>
-            <w:tcW w:type="dxa" w:w="2645"/>
+            <w:tcW w:type="dxa" w:w="2359"/>
             <w:tcMar>
               <w:top w:type="dxa" w:w="60"/>
               <w:left w:type="dxa" w:w="90"/>
@@ -9442,7 +9679,7 @@
         </w:tc>
         <w:tc>
           <w:tcPr>
-            <w:tcW w:type="dxa" w:w="2357"/>
+            <w:tcW w:type="dxa" w:w="3077"/>
             <w:tcMar>
               <w:top w:type="dxa" w:w="60"/>
               <w:left w:type="dxa" w:w="90"/>
@@ -9468,7 +9705,7 @@
         </w:tc>
         <w:tc>
           <w:tcPr>
-            <w:tcW w:type="dxa" w:w="2414"/>
+            <w:tcW w:type="dxa" w:w="2154"/>
             <w:tcMar>
               <w:top w:type="dxa" w:w="60"/>
               <w:left w:type="dxa" w:w="90"/>
@@ -9496,7 +9733,7 @@
       <w:tr>
         <w:tc>
           <w:tcPr>
-            <w:tcW w:type="dxa" w:w="1610"/>
+            <w:tcW w:type="dxa" w:w="1436"/>
             <w:tcMar>
               <w:top w:type="dxa" w:w="60"/>
               <w:left w:type="dxa" w:w="90"/>
@@ -9522,7 +9759,7 @@
         </w:tc>
         <w:tc>
           <w:tcPr>
-            <w:tcW w:type="dxa" w:w="2645"/>
+            <w:tcW w:type="dxa" w:w="2359"/>
             <w:tcMar>
               <w:top w:type="dxa" w:w="60"/>
               <w:left w:type="dxa" w:w="90"/>
@@ -9548,7 +9785,7 @@
         </w:tc>
         <w:tc>
           <w:tcPr>
-            <w:tcW w:type="dxa" w:w="2357"/>
+            <w:tcW w:type="dxa" w:w="3077"/>
             <w:tcMar>
               <w:top w:type="dxa" w:w="60"/>
               <w:left w:type="dxa" w:w="90"/>
@@ -9574,7 +9811,7 @@
         </w:tc>
         <w:tc>
           <w:tcPr>
-            <w:tcW w:type="dxa" w:w="2414"/>
+            <w:tcW w:type="dxa" w:w="2154"/>
             <w:tcMar>
               <w:top w:type="dxa" w:w="60"/>
               <w:left w:type="dxa" w:w="90"/>
@@ -9602,7 +9839,7 @@
       <w:tr>
         <w:tc>
           <w:tcPr>
-            <w:tcW w:type="dxa" w:w="1610"/>
+            <w:tcW w:type="dxa" w:w="1436"/>
             <w:tcMar>
               <w:top w:type="dxa" w:w="60"/>
               <w:left w:type="dxa" w:w="90"/>
@@ -9628,7 +9865,7 @@
         </w:tc>
         <w:tc>
           <w:tcPr>
-            <w:tcW w:type="dxa" w:w="2645"/>
+            <w:tcW w:type="dxa" w:w="2359"/>
             <w:tcMar>
               <w:top w:type="dxa" w:w="60"/>
               <w:left w:type="dxa" w:w="90"/>
@@ -9654,7 +9891,7 @@
         </w:tc>
         <w:tc>
           <w:tcPr>
-            <w:tcW w:type="dxa" w:w="2357"/>
+            <w:tcW w:type="dxa" w:w="3077"/>
             <w:tcMar>
               <w:top w:type="dxa" w:w="60"/>
               <w:left w:type="dxa" w:w="90"/>
@@ -9680,7 +9917,7 @@
         </w:tc>
         <w:tc>
           <w:tcPr>
-            <w:tcW w:type="dxa" w:w="2414"/>
+            <w:tcW w:type="dxa" w:w="2154"/>
             <w:tcMar>
               <w:top w:type="dxa" w:w="60"/>
               <w:left w:type="dxa" w:w="90"/>
@@ -9708,7 +9945,7 @@
       <w:tr>
         <w:tc>
           <w:tcPr>
-            <w:tcW w:type="dxa" w:w="1610"/>
+            <w:tcW w:type="dxa" w:w="1436"/>
             <w:tcMar>
               <w:top w:type="dxa" w:w="60"/>
               <w:left w:type="dxa" w:w="90"/>
@@ -9734,7 +9971,7 @@
         </w:tc>
         <w:tc>
           <w:tcPr>
-            <w:tcW w:type="dxa" w:w="2645"/>
+            <w:tcW w:type="dxa" w:w="2359"/>
             <w:tcMar>
               <w:top w:type="dxa" w:w="60"/>
               <w:left w:type="dxa" w:w="90"/>
@@ -9760,7 +9997,7 @@
         </w:tc>
         <w:tc>
           <w:tcPr>
-            <w:tcW w:type="dxa" w:w="2357"/>
+            <w:tcW w:type="dxa" w:w="3077"/>
             <w:tcMar>
               <w:top w:type="dxa" w:w="60"/>
               <w:left w:type="dxa" w:w="90"/>
@@ -9786,7 +10023,7 @@
         </w:tc>
         <w:tc>
           <w:tcPr>
-            <w:tcW w:type="dxa" w:w="2414"/>
+            <w:tcW w:type="dxa" w:w="2154"/>
             <w:tcMar>
               <w:top w:type="dxa" w:w="60"/>
               <w:left w:type="dxa" w:w="90"/>
@@ -10004,7 +10241,7 @@
           <w:sz w:val="34"/>
           <w:szCs w:val="34"/>
         </w:rPr>
-        <w:t xml:space="preserve"> ระบบแสดงสถานะของแต่ละร้าน เช่น รอตรวจนับ หรือจ่ายเงินแล้ว</w:t>
+        <w:t xml:space="preserve"> ระบบแสดงสถานะของแต่ละร้าน เช่น รอตรวจนับ หรือจ่ายเงินแล้ว คูปองกระดาษใช้ได้เฉพาะหน้าร้านหรือที่ POS เท่านั้น ไม่สามารถนำรหัสไปกรอกใช้ในเว็บได้ เพราะรหัสเหมือนกันทั้งชุดและกันการใช้ซ้ำด้วยวิธีฉีกกระดาษเท่านั้น</w:t>
       </w:r>
     </w:p>
     <w:p>
@@ -10507,8 +10744,8 @@
         </w:tblBorders>
       </w:tblPr>
       <w:tblGrid>
-        <w:gridCol w:w="2801"/>
-        <w:gridCol w:w="6225"/>
+        <w:gridCol w:w="3664"/>
+        <w:gridCol w:w="5362"/>
       </w:tblGrid>
       <w:tr>
         <w:trPr>
@@ -10516,7 +10753,7 @@
         </w:trPr>
         <w:tc>
           <w:tcPr>
-            <w:tcW w:type="dxa" w:w="2801"/>
+            <w:tcW w:type="dxa" w:w="3664"/>
             <w:shd w:fill="A32F34" w:color="auto" w:val="clear"/>
             <w:tcMar>
               <w:top w:type="dxa" w:w="60"/>
@@ -10544,7 +10781,7 @@
         </w:tc>
         <w:tc>
           <w:tcPr>
-            <w:tcW w:type="dxa" w:w="6225"/>
+            <w:tcW w:type="dxa" w:w="5362"/>
             <w:shd w:fill="A32F34" w:color="auto" w:val="clear"/>
             <w:tcMar>
               <w:top w:type="dxa" w:w="60"/>
@@ -10574,7 +10811,7 @@
       <w:tr>
         <w:tc>
           <w:tcPr>
-            <w:tcW w:type="dxa" w:w="2801"/>
+            <w:tcW w:type="dxa" w:w="3664"/>
             <w:tcMar>
               <w:top w:type="dxa" w:w="60"/>
               <w:left w:type="dxa" w:w="90"/>
@@ -10600,7 +10837,7 @@
         </w:tc>
         <w:tc>
           <w:tcPr>
-            <w:tcW w:type="dxa" w:w="6225"/>
+            <w:tcW w:type="dxa" w:w="5362"/>
             <w:tcMar>
               <w:top w:type="dxa" w:w="60"/>
               <w:left w:type="dxa" w:w="90"/>
@@ -10628,7 +10865,7 @@
       <w:tr>
         <w:tc>
           <w:tcPr>
-            <w:tcW w:type="dxa" w:w="2801"/>
+            <w:tcW w:type="dxa" w:w="3664"/>
             <w:tcMar>
               <w:top w:type="dxa" w:w="60"/>
               <w:left w:type="dxa" w:w="90"/>
@@ -10654,7 +10891,7 @@
         </w:tc>
         <w:tc>
           <w:tcPr>
-            <w:tcW w:type="dxa" w:w="6225"/>
+            <w:tcW w:type="dxa" w:w="5362"/>
             <w:tcMar>
               <w:top w:type="dxa" w:w="60"/>
               <w:left w:type="dxa" w:w="90"/>
@@ -10682,7 +10919,7 @@
       <w:tr>
         <w:tc>
           <w:tcPr>
-            <w:tcW w:type="dxa" w:w="2801"/>
+            <w:tcW w:type="dxa" w:w="3664"/>
             <w:tcMar>
               <w:top w:type="dxa" w:w="60"/>
               <w:left w:type="dxa" w:w="90"/>
@@ -10708,7 +10945,7 @@
         </w:tc>
         <w:tc>
           <w:tcPr>
-            <w:tcW w:type="dxa" w:w="6225"/>
+            <w:tcW w:type="dxa" w:w="5362"/>
             <w:tcMar>
               <w:top w:type="dxa" w:w="60"/>
               <w:left w:type="dxa" w:w="90"/>
@@ -10736,7 +10973,7 @@
       <w:tr>
         <w:tc>
           <w:tcPr>
-            <w:tcW w:type="dxa" w:w="2801"/>
+            <w:tcW w:type="dxa" w:w="3664"/>
             <w:tcMar>
               <w:top w:type="dxa" w:w="60"/>
               <w:left w:type="dxa" w:w="90"/>
@@ -10762,7 +10999,7 @@
         </w:tc>
         <w:tc>
           <w:tcPr>
-            <w:tcW w:type="dxa" w:w="6225"/>
+            <w:tcW w:type="dxa" w:w="5362"/>
             <w:tcMar>
               <w:top w:type="dxa" w:w="60"/>
               <w:left w:type="dxa" w:w="90"/>
@@ -10783,6 +11020,60 @@
                 <w:szCs w:val="27"/>
               </w:rPr>
               <w:t xml:space="preserve">ยอดซื้อขั้นต่ำ และมูลค่าส่วนลดต้อนรับ</w:t>
+            </w:r>
+          </w:p>
+        </w:tc>
+      </w:tr>
+      <w:tr>
+        <w:tc>
+          <w:tcPr>
+            <w:tcW w:type="dxa" w:w="3664"/>
+            <w:tcMar>
+              <w:top w:type="dxa" w:w="60"/>
+              <w:left w:type="dxa" w:w="90"/>
+              <w:bottom w:type="dxa" w:w="60"/>
+              <w:right w:type="dxa" w:w="90"/>
+            </w:tcMar>
+          </w:tcPr>
+          <w:p>
+            <w:pPr>
+              <w:spacing w:after="0" w:before="0"/>
+            </w:pPr>
+            <w:r>
+              <w:rPr>
+                <w:rFonts w:ascii="TH SarabunPSK" w:cs="TH SarabunPSK" w:eastAsia="TH SarabunPSK" w:hAnsi="TH SarabunPSK"/>
+                <w:b w:val="false"/>
+                <w:bCs w:val="false"/>
+                <w:sz w:val="27"/>
+                <w:szCs w:val="27"/>
+              </w:rPr>
+              <w:t xml:space="preserve">เพดานส่วนลดสูงสุด (ทุกแบบที่เป็นส่วนลด %)</w:t>
+            </w:r>
+          </w:p>
+        </w:tc>
+        <w:tc>
+          <w:tcPr>
+            <w:tcW w:type="dxa" w:w="5362"/>
+            <w:tcMar>
+              <w:top w:type="dxa" w:w="60"/>
+              <w:left w:type="dxa" w:w="90"/>
+              <w:bottom w:type="dxa" w:w="60"/>
+              <w:right w:type="dxa" w:w="90"/>
+            </w:tcMar>
+          </w:tcPr>
+          <w:p>
+            <w:pPr>
+              <w:spacing w:after="0" w:before="0"/>
+            </w:pPr>
+            <w:r>
+              <w:rPr>
+                <w:rFonts w:ascii="TH SarabunPSK" w:cs="TH SarabunPSK" w:eastAsia="TH SarabunPSK" w:hAnsi="TH SarabunPSK"/>
+                <w:b w:val="false"/>
+                <w:bCs w:val="false"/>
+                <w:sz w:val="27"/>
+                <w:szCs w:val="27"/>
+              </w:rPr>
+              <w:t xml:space="preserve">ตั้งเพดานบาทสูงสุดได้ เช่น ลด 15% สูงสุดไม่เกิน 100 บาท</w:t>
             </w:r>
           </w:p>
         </w:tc>
@@ -10894,6 +11185,34 @@
           <w:szCs w:val="34"/>
         </w:rPr>
         <w:t xml:space="preserve">ตัวอย่าง: ซื้อสินค้าที่ได้ 10 พอยท์ต่อชิ้น จำนวน 2 ชิ้น และสินค้าอีกรายการที่ได้ 0 พอยท์ รวมได้ 20 พอยท์ทันทีที่ชำระเงินสำเร็จ</w:t>
+      </w:r>
+    </w:p>
+    <w:p>
+      <w:pPr>
+        <w:spacing w:after="120" w:line="400"/>
+        <w:jc w:val="both"/>
+      </w:pPr>
+      <w:r>
+        <w:rPr>
+          <w:rFonts w:ascii="TH SarabunPSK" w:cs="TH SarabunPSK" w:eastAsia="TH SarabunPSK" w:hAnsi="TH SarabunPSK"/>
+          <w:sz w:val="34"/>
+          <w:szCs w:val="34"/>
+        </w:rPr>
+        <w:t xml:space="preserve">ถ้ามีหลายแคมเปญที่มีตัวคูณพอยท์ active พร้อมกัน ตัวคูณจะบวกกัน เช่น แคมเปญหนึ่งตัวคูณ ×1.5 และอีกแคมเปญ ×2 ลูกค้าจะได้รับตัวคูณรวม ×3.5</w:t>
+      </w:r>
+    </w:p>
+    <w:p>
+      <w:pPr>
+        <w:spacing w:after="120" w:line="400"/>
+        <w:jc w:val="both"/>
+      </w:pPr>
+      <w:r>
+        <w:rPr>
+          <w:rFonts w:ascii="TH SarabunPSK" w:cs="TH SarabunPSK" w:eastAsia="TH SarabunPSK" w:hAnsi="TH SarabunPSK"/>
+          <w:sz w:val="34"/>
+          <w:szCs w:val="34"/>
+        </w:rPr>
+        <w:t xml:space="preserve">พอยท์ที่ได้มีวันหมดอายุ โดยแอดมินกำหนดวันหมดอายุของพอยท์แต่ละรอบหรือแต่ละแคมเปญที่แจกพอยท์ได้เอง ไม่ได้ fix เป็นนโยบายเดียวทั้งระบบ</w:t>
       </w:r>
     </w:p>
     <w:p>
@@ -11845,7 +12164,7 @@
           <w:sz w:val="34"/>
           <w:szCs w:val="34"/>
         </w:rPr>
-        <w:t xml:space="preserve">สำหรับร้านขายส่งที่ทำสัญญาสะสมยอดซื้อรายปี แคมเปญจะปลดล็อกรางวัลตามขั้นบันไดของยอดสะสม รางวัลบางรายการไม่ได้อยู่ในคลังสินค้า POS เช่น ตั๋วเดินทาง หรือเครื่องใช้ไฟฟ้า</w:t>
+        <w:t xml:space="preserve">สำหรับร้านขายส่งที่ทำสัญญาสะสมยอดซื้อรายปี แคมเปญจะปลดล็อกรางวัลตามขั้นบันไดของยอดสะสม รางวัลบางรายการไม่ได้อยู่ในคลังสินค้า POS เช่น ตั๋วเดินทาง หรือเครื่องใช้ไฟฟ้า ยอดสะสมจะรีเซ็ตเป็นศูนย์ทุกครั้งที่ขึ้นสัญญาปีใหม่ ไม่สะสมข้ามปี</w:t>
       </w:r>
     </w:p>
     <w:p>
@@ -12466,7 +12785,61 @@
                 <w:sz w:val="27"/>
                 <w:szCs w:val="27"/>
               </w:rPr>
-              <w:t xml:space="preserve">ตั้งเกณฑ์ยอดสะสมแต่ละขั้น ของรางวัล (รวมของที่ไม่อยู่ใน POS) และออกแบบฟอร์มขอข้อมูลตอนรับสิทธิ์เอง</w:t>
+              <w:t xml:space="preserve">ตั้งเกณฑ์ยอดสะสมแต่ละขั้น ของรางวัล (รวมของที่ไม่อยู่ใน POS) และออกแบบฟอร์มขอข้อมูลตอนรับสิทธิ์เอง ยอดสะสมรีเซ็ตเองทุกปีสัญญาใหม่</w:t>
+            </w:r>
+          </w:p>
+        </w:tc>
+      </w:tr>
+      <w:tr>
+        <w:tc>
+          <w:tcPr>
+            <w:tcW w:type="dxa" w:w="2083"/>
+            <w:tcMar>
+              <w:top w:type="dxa" w:w="60"/>
+              <w:left w:type="dxa" w:w="90"/>
+              <w:bottom w:type="dxa" w:w="60"/>
+              <w:right w:type="dxa" w:w="90"/>
+            </w:tcMar>
+          </w:tcPr>
+          <w:p>
+            <w:pPr>
+              <w:spacing w:after="0" w:before="0"/>
+            </w:pPr>
+            <w:r>
+              <w:rPr>
+                <w:rFonts w:ascii="TH SarabunPSK" w:cs="TH SarabunPSK" w:eastAsia="TH SarabunPSK" w:hAnsi="TH SarabunPSK"/>
+                <w:b w:val="false"/>
+                <w:bCs w:val="false"/>
+                <w:sz w:val="27"/>
+                <w:szCs w:val="27"/>
+              </w:rPr>
+              <w:t xml:space="preserve">วันหมดอายุพอยท์</w:t>
+            </w:r>
+          </w:p>
+        </w:tc>
+        <w:tc>
+          <w:tcPr>
+            <w:tcW w:type="dxa" w:w="6943"/>
+            <w:tcMar>
+              <w:top w:type="dxa" w:w="60"/>
+              <w:left w:type="dxa" w:w="90"/>
+              <w:bottom w:type="dxa" w:w="60"/>
+              <w:right w:type="dxa" w:w="90"/>
+            </w:tcMar>
+          </w:tcPr>
+          <w:p>
+            <w:pPr>
+              <w:spacing w:after="0" w:before="0"/>
+            </w:pPr>
+            <w:r>
+              <w:rPr>
+                <w:rFonts w:ascii="TH SarabunPSK" w:cs="TH SarabunPSK" w:eastAsia="TH SarabunPSK" w:hAnsi="TH SarabunPSK"/>
+                <w:b w:val="false"/>
+                <w:bCs w:val="false"/>
+                <w:sz w:val="27"/>
+                <w:szCs w:val="27"/>
+              </w:rPr>
+              <w:t xml:space="preserve">กำหนดวันหมดอายุของพอยท์แต่ละรอบหรือแคมเปญที่แจกได้เอง</w:t>
             </w:r>
           </w:p>
         </w:tc>
@@ -13637,6 +14010,29 @@
     </w:p>
     <w:p>
       <w:pPr>
+        <w:spacing w:after="80" w:line="400"/>
+        <w:ind w:left="360" w:hanging="300"/>
+        <w:jc w:val="both"/>
+      </w:pPr>
+      <w:r>
+        <w:rPr>
+          <w:rFonts w:ascii="TH SarabunPSK" w:cs="TH SarabunPSK" w:eastAsia="TH SarabunPSK" w:hAnsi="TH SarabunPSK"/>
+          <w:sz w:val="34"/>
+          <w:szCs w:val="34"/>
+        </w:rPr>
+        <w:t xml:space="preserve">•  </w:t>
+      </w:r>
+      <w:r>
+        <w:rPr>
+          <w:rFonts w:ascii="TH SarabunPSK" w:cs="TH SarabunPSK" w:eastAsia="TH SarabunPSK" w:hAnsi="TH SarabunPSK"/>
+          <w:sz w:val="34"/>
+          <w:szCs w:val="34"/>
+        </w:rPr>
+        <w:t xml:space="preserve">จำกัดจำนวนสิทธิ์ลุ้นที่ลูกค้าคนเดียวซื้อสะสมได้ต่อรอบหรือต่อวัน (กันลูกค้ารายเดียวกว้านสิทธิ์ทั้งหมด) แอดมินตั้งค่าเพดานนี้ได้</w:t>
+      </w:r>
+    </w:p>
+    <w:p>
+      <w:pPr>
         <w:pStyle w:val="Heading3"/>
         <w:keepNext/>
         <w:spacing w:after="120" w:before="240"/>
@@ -14785,6 +15181,60 @@
           </w:p>
         </w:tc>
       </w:tr>
+      <w:tr>
+        <w:tc>
+          <w:tcPr>
+            <w:tcW w:type="dxa" w:w="2257"/>
+            <w:tcMar>
+              <w:top w:type="dxa" w:w="60"/>
+              <w:left w:type="dxa" w:w="90"/>
+              <w:bottom w:type="dxa" w:w="60"/>
+              <w:right w:type="dxa" w:w="90"/>
+            </w:tcMar>
+          </w:tcPr>
+          <w:p>
+            <w:pPr>
+              <w:spacing w:after="0" w:before="0"/>
+            </w:pPr>
+            <w:r>
+              <w:rPr>
+                <w:rFonts w:ascii="TH SarabunPSK" w:cs="TH SarabunPSK" w:eastAsia="TH SarabunPSK" w:hAnsi="TH SarabunPSK"/>
+                <w:b w:val="false"/>
+                <w:bCs w:val="false"/>
+                <w:sz w:val="27"/>
+                <w:szCs w:val="27"/>
+              </w:rPr>
+              <w:t xml:space="preserve">เพดานสิทธิ์ต่อคน</w:t>
+            </w:r>
+          </w:p>
+        </w:tc>
+        <w:tc>
+          <w:tcPr>
+            <w:tcW w:type="dxa" w:w="6769"/>
+            <w:tcMar>
+              <w:top w:type="dxa" w:w="60"/>
+              <w:left w:type="dxa" w:w="90"/>
+              <w:bottom w:type="dxa" w:w="60"/>
+              <w:right w:type="dxa" w:w="90"/>
+            </w:tcMar>
+          </w:tcPr>
+          <w:p>
+            <w:pPr>
+              <w:spacing w:after="0" w:before="0"/>
+            </w:pPr>
+            <w:r>
+              <w:rPr>
+                <w:rFonts w:ascii="TH SarabunPSK" w:cs="TH SarabunPSK" w:eastAsia="TH SarabunPSK" w:hAnsi="TH SarabunPSK"/>
+                <w:b w:val="false"/>
+                <w:bCs w:val="false"/>
+                <w:sz w:val="27"/>
+                <w:szCs w:val="27"/>
+              </w:rPr>
+              <w:t xml:space="preserve">จำกัดจำนวนสิทธิ์ลุ้นสะสมที่ลูกค้าคนเดียวซื้อได้ต่อรอบหรือต่อวัน</w:t>
+            </w:r>
+          </w:p>
+        </w:tc>
+      </w:tr>
     </w:tbl>
     <w:p>
       <w:pPr>
@@ -14844,6 +15294,34 @@
           <w:szCs w:val="34"/>
         </w:rPr>
         <w:t xml:space="preserve">เซตร้านยาเปิดใหม่คือชุดสินค้าเริ่มต้นสำหรับผู้ที่กำลังเปิดร้านยาใหม่ ลูกค้าสามารถเลือกซื้อทั้งเซตและปรับรายการทางเลือกได้ตามความต้องการ ใช้ได้กับเซตขนาดมาตรฐานหรือเซตที่แอดมินกำหนดเพิ่มเอง</w:t>
+      </w:r>
+    </w:p>
+    <w:p>
+      <w:pPr>
+        <w:spacing w:after="120" w:line="400"/>
+        <w:jc w:val="both"/>
+      </w:pPr>
+      <w:r>
+        <w:rPr>
+          <w:rFonts w:ascii="TH SarabunPSK" w:cs="TH SarabunPSK" w:eastAsia="TH SarabunPSK" w:hAnsi="TH SarabunPSK"/>
+          <w:sz w:val="34"/>
+          <w:szCs w:val="34"/>
+        </w:rPr>
+        <w:t xml:space="preserve">ใช้ได้เฉพาะลูกค้าประเภทร้านค้า (B2B) เท่านั้น ไม่เปิดให้ลูกค้าทั่วไป (B2C)</w:t>
+      </w:r>
+    </w:p>
+    <w:p>
+      <w:pPr>
+        <w:spacing w:after="120" w:line="400"/>
+        <w:jc w:val="both"/>
+      </w:pPr>
+      <w:r>
+        <w:rPr>
+          <w:rFonts w:ascii="TH SarabunPSK" w:cs="TH SarabunPSK" w:eastAsia="TH SarabunPSK" w:hAnsi="TH SarabunPSK"/>
+          <w:sz w:val="34"/>
+          <w:szCs w:val="34"/>
+        </w:rPr>
+        <w:t xml:space="preserve">ลูกค้าสั่งซื้อเองผ่านหน้าเว็บได้โดยตรง หรือให้แอดมิน/เซลล์เข้าไปสั่งซื้อแทนในหน้าแอดมินก็ได้ ทั้งสองทางใช้ราคาและเงื่อนไขชุดเดียวกัน</w:t>
       </w:r>
     </w:p>
     <w:p>
@@ -15348,6 +15826,29 @@
     </w:p>
     <w:p>
       <w:pPr>
+        <w:spacing w:after="80" w:line="400"/>
+        <w:ind w:left="360" w:hanging="300"/>
+        <w:jc w:val="both"/>
+      </w:pPr>
+      <w:r>
+        <w:rPr>
+          <w:rFonts w:ascii="TH SarabunPSK" w:cs="TH SarabunPSK" w:eastAsia="TH SarabunPSK" w:hAnsi="TH SarabunPSK"/>
+          <w:sz w:val="34"/>
+          <w:szCs w:val="34"/>
+        </w:rPr>
+        <w:t xml:space="preserve">•  </w:t>
+      </w:r>
+      <w:r>
+        <w:rPr>
+          <w:rFonts w:ascii="TH SarabunPSK" w:cs="TH SarabunPSK" w:eastAsia="TH SarabunPSK" w:hAnsi="TH SarabunPSK"/>
+          <w:sz w:val="34"/>
+          <w:szCs w:val="34"/>
+        </w:rPr>
+        <w:t xml:space="preserve">ถ้าสินค้าบังคับในเซตหมดสต็อกระหว่างลูกค้ากำลังสั่งซื้อ ระบบจะบล็อกการสั่งทั้งเซตไว้ก่อน จนกว่าแอดมินจะเติมสต็อก</w:t>
+      </w:r>
+    </w:p>
+    <w:p>
+      <w:pPr>
         <w:pStyle w:val="Heading3"/>
         <w:keepNext/>
         <w:spacing w:after="120" w:before="240"/>
@@ -15439,8 +15940,8 @@
         </w:tblBorders>
       </w:tblPr>
       <w:tblGrid>
-        <w:gridCol w:w="2298"/>
-        <w:gridCol w:w="6728"/>
+        <w:gridCol w:w="2285"/>
+        <w:gridCol w:w="6741"/>
       </w:tblGrid>
       <w:tr>
         <w:trPr>
@@ -15448,7 +15949,7 @@
         </w:trPr>
         <w:tc>
           <w:tcPr>
-            <w:tcW w:type="dxa" w:w="2298"/>
+            <w:tcW w:type="dxa" w:w="2285"/>
             <w:shd w:fill="A32F34" w:color="auto" w:val="clear"/>
             <w:tcMar>
               <w:top w:type="dxa" w:w="60"/>
@@ -15476,7 +15977,7 @@
         </w:tc>
         <w:tc>
           <w:tcPr>
-            <w:tcW w:type="dxa" w:w="6728"/>
+            <w:tcW w:type="dxa" w:w="6741"/>
             <w:shd w:fill="A32F34" w:color="auto" w:val="clear"/>
             <w:tcMar>
               <w:top w:type="dxa" w:w="60"/>
@@ -15506,7 +16007,7 @@
       <w:tr>
         <w:tc>
           <w:tcPr>
-            <w:tcW w:type="dxa" w:w="2298"/>
+            <w:tcW w:type="dxa" w:w="2285"/>
             <w:tcMar>
               <w:top w:type="dxa" w:w="60"/>
               <w:left w:type="dxa" w:w="90"/>
@@ -15532,7 +16033,7 @@
         </w:tc>
         <w:tc>
           <w:tcPr>
-            <w:tcW w:type="dxa" w:w="6728"/>
+            <w:tcW w:type="dxa" w:w="6741"/>
             <w:tcMar>
               <w:top w:type="dxa" w:w="60"/>
               <w:left w:type="dxa" w:w="90"/>
@@ -15560,7 +16061,7 @@
       <w:tr>
         <w:tc>
           <w:tcPr>
-            <w:tcW w:type="dxa" w:w="2298"/>
+            <w:tcW w:type="dxa" w:w="2285"/>
             <w:tcMar>
               <w:top w:type="dxa" w:w="60"/>
               <w:left w:type="dxa" w:w="90"/>
@@ -15586,7 +16087,7 @@
         </w:tc>
         <w:tc>
           <w:tcPr>
-            <w:tcW w:type="dxa" w:w="6728"/>
+            <w:tcW w:type="dxa" w:w="6741"/>
             <w:tcMar>
               <w:top w:type="dxa" w:w="60"/>
               <w:left w:type="dxa" w:w="90"/>
@@ -15614,7 +16115,7 @@
       <w:tr>
         <w:tc>
           <w:tcPr>
-            <w:tcW w:type="dxa" w:w="2298"/>
+            <w:tcW w:type="dxa" w:w="2285"/>
             <w:tcMar>
               <w:top w:type="dxa" w:w="60"/>
               <w:left w:type="dxa" w:w="90"/>
@@ -15640,7 +16141,7 @@
         </w:tc>
         <w:tc>
           <w:tcPr>
-            <w:tcW w:type="dxa" w:w="6728"/>
+            <w:tcW w:type="dxa" w:w="6741"/>
             <w:tcMar>
               <w:top w:type="dxa" w:w="60"/>
               <w:left w:type="dxa" w:w="90"/>
@@ -15668,7 +16169,7 @@
       <w:tr>
         <w:tc>
           <w:tcPr>
-            <w:tcW w:type="dxa" w:w="2298"/>
+            <w:tcW w:type="dxa" w:w="2285"/>
             <w:tcMar>
               <w:top w:type="dxa" w:w="60"/>
               <w:left w:type="dxa" w:w="90"/>
@@ -15694,7 +16195,7 @@
         </w:tc>
         <w:tc>
           <w:tcPr>
-            <w:tcW w:type="dxa" w:w="6728"/>
+            <w:tcW w:type="dxa" w:w="6741"/>
             <w:tcMar>
               <w:top w:type="dxa" w:w="60"/>
               <w:left w:type="dxa" w:w="90"/>
@@ -15715,6 +16216,114 @@
                 <w:szCs w:val="27"/>
               </w:rPr>
               <w:t xml:space="preserve">ตั้งส่วนลดรวมเมื่อซื้อทั้งเซต</w:t>
+            </w:r>
+          </w:p>
+        </w:tc>
+      </w:tr>
+      <w:tr>
+        <w:tc>
+          <w:tcPr>
+            <w:tcW w:type="dxa" w:w="2285"/>
+            <w:tcMar>
+              <w:top w:type="dxa" w:w="60"/>
+              <w:left w:type="dxa" w:w="90"/>
+              <w:bottom w:type="dxa" w:w="60"/>
+              <w:right w:type="dxa" w:w="90"/>
+            </w:tcMar>
+          </w:tcPr>
+          <w:p>
+            <w:pPr>
+              <w:spacing w:after="0" w:before="0"/>
+            </w:pPr>
+            <w:r>
+              <w:rPr>
+                <w:rFonts w:ascii="TH SarabunPSK" w:cs="TH SarabunPSK" w:eastAsia="TH SarabunPSK" w:hAnsi="TH SarabunPSK"/>
+                <w:b w:val="false"/>
+                <w:bCs w:val="false"/>
+                <w:sz w:val="27"/>
+                <w:szCs w:val="27"/>
+              </w:rPr>
+              <w:t xml:space="preserve">ลูกค้าที่สั่งซื้อได้</w:t>
+            </w:r>
+          </w:p>
+        </w:tc>
+        <w:tc>
+          <w:tcPr>
+            <w:tcW w:type="dxa" w:w="6741"/>
+            <w:tcMar>
+              <w:top w:type="dxa" w:w="60"/>
+              <w:left w:type="dxa" w:w="90"/>
+              <w:bottom w:type="dxa" w:w="60"/>
+              <w:right w:type="dxa" w:w="90"/>
+            </w:tcMar>
+          </w:tcPr>
+          <w:p>
+            <w:pPr>
+              <w:spacing w:after="0" w:before="0"/>
+            </w:pPr>
+            <w:r>
+              <w:rPr>
+                <w:rFonts w:ascii="TH SarabunPSK" w:cs="TH SarabunPSK" w:eastAsia="TH SarabunPSK" w:hAnsi="TH SarabunPSK"/>
+                <w:b w:val="false"/>
+                <w:bCs w:val="false"/>
+                <w:sz w:val="27"/>
+                <w:szCs w:val="27"/>
+              </w:rPr>
+              <w:t xml:space="preserve">เฉพาะบัญชีร้านค้า (B2B) เท่านั้น</w:t>
+            </w:r>
+          </w:p>
+        </w:tc>
+      </w:tr>
+      <w:tr>
+        <w:tc>
+          <w:tcPr>
+            <w:tcW w:type="dxa" w:w="2285"/>
+            <w:tcMar>
+              <w:top w:type="dxa" w:w="60"/>
+              <w:left w:type="dxa" w:w="90"/>
+              <w:bottom w:type="dxa" w:w="60"/>
+              <w:right w:type="dxa" w:w="90"/>
+            </w:tcMar>
+          </w:tcPr>
+          <w:p>
+            <w:pPr>
+              <w:spacing w:after="0" w:before="0"/>
+            </w:pPr>
+            <w:r>
+              <w:rPr>
+                <w:rFonts w:ascii="TH SarabunPSK" w:cs="TH SarabunPSK" w:eastAsia="TH SarabunPSK" w:hAnsi="TH SarabunPSK"/>
+                <w:b w:val="false"/>
+                <w:bCs w:val="false"/>
+                <w:sz w:val="27"/>
+                <w:szCs w:val="27"/>
+              </w:rPr>
+              <w:t xml:space="preserve">สั่งซื้อแทนลูกค้า</w:t>
+            </w:r>
+          </w:p>
+        </w:tc>
+        <w:tc>
+          <w:tcPr>
+            <w:tcW w:type="dxa" w:w="6741"/>
+            <w:tcMar>
+              <w:top w:type="dxa" w:w="60"/>
+              <w:left w:type="dxa" w:w="90"/>
+              <w:bottom w:type="dxa" w:w="60"/>
+              <w:right w:type="dxa" w:w="90"/>
+            </w:tcMar>
+          </w:tcPr>
+          <w:p>
+            <w:pPr>
+              <w:spacing w:after="0" w:before="0"/>
+            </w:pPr>
+            <w:r>
+              <w:rPr>
+                <w:rFonts w:ascii="TH SarabunPSK" w:cs="TH SarabunPSK" w:eastAsia="TH SarabunPSK" w:hAnsi="TH SarabunPSK"/>
+                <w:b w:val="false"/>
+                <w:bCs w:val="false"/>
+                <w:sz w:val="27"/>
+                <w:szCs w:val="27"/>
+              </w:rPr>
+              <w:t xml:space="preserve">แอดมิน/เซลล์เลือกบัญชีลูกค้าแล้วสั่งซื้อแทนได้จากหน้าแอดมิน</w:t>
             </w:r>
           </w:p>
         </w:tc>

</xml_diff>